<commit_message>
feat(scribble): redesigned report docx template — cover, TOC field, colored severity table, page footer
</commit_message>
<xml_diff>
--- a/scribble/scribble/report_templates/default.docx
+++ b/scribble/scribble/report_templates/default.docx
@@ -2,42 +2,131 @@
 <file path=word/document.xml><?xml version="1.0" encoding="utf-8"?>
 <w:document xmlns:wpc="http://schemas.microsoft.com/office/word/2010/wordprocessingCanvas" xmlns:mo="http://schemas.microsoft.com/office/mac/office/2008/main" xmlns:mc="http://schemas.openxmlformats.org/markup-compatibility/2006" xmlns:mv="urn:schemas-microsoft-com:mac:vml" xmlns:o="urn:schemas-microsoft-com:office:office" xmlns:r="http://schemas.openxmlformats.org/officeDocument/2006/relationships" xmlns:m="http://schemas.openxmlformats.org/officeDocument/2006/math" xmlns:v="urn:schemas-microsoft-com:vml" xmlns:wp14="http://schemas.microsoft.com/office/word/2010/wordprocessingDrawing" xmlns:wp="http://schemas.openxmlformats.org/drawingml/2006/wordprocessingDrawing" xmlns:w10="urn:schemas-microsoft-com:office:word" xmlns:w="http://schemas.openxmlformats.org/wordprocessingml/2006/main" xmlns:w14="http://schemas.microsoft.com/office/word/2010/wordml" xmlns:wpg="http://schemas.microsoft.com/office/word/2010/wordprocessingGroup" xmlns:wpi="http://schemas.microsoft.com/office/word/2010/wordprocessingInk" xmlns:wne="http://schemas.microsoft.com/office/word/2006/wordml" xmlns:wps="http://schemas.microsoft.com/office/word/2010/wordprocessingShape" mc:Ignorable="w14 wp14">
   <w:body>
+    <w:tbl>
+      <w:tblPr>
+        <w:tblW w:type="auto" w:w="0"/>
+        <w:tblLayout w:type="autofit"/>
+        <w:tblLook w:firstColumn="1" w:firstRow="1" w:lastColumn="0" w:lastRow="0" w:noHBand="0" w:noVBand="1" w:val="04A0"/>
+      </w:tblPr>
+      <w:tblGrid>
+        <w:gridCol w:w="8640"/>
+      </w:tblGrid>
+      <w:tr>
+        <w:tc>
+          <w:tcPr>
+            <w:tcW w:type="dxa" w:w="8640"/>
+            <w:shd w:val="clear" w:color="auto" w:fill="0F7A52"/>
+            <w:shd w:val="clear" w:color="auto" w:fill="0F7A52"/>
+          </w:tcPr>
+          <w:p>
+            <w:pPr>
+              <w:spacing w:before="200" w:after="200"/>
+            </w:pPr>
+            <w:r>
+              <w:rPr>
+                <w:rFonts w:ascii="Liberation Sans" w:hAnsi="Liberation Sans"/>
+                <w:b/>
+                <w:color w:val="FFFFFF"/>
+                <w:sz w:val="48"/>
+              </w:rPr>
+              <w:t>{{ engagement_name }}</w:t>
+            </w:r>
+          </w:p>
+        </w:tc>
+      </w:tr>
+    </w:tbl>
+    <w:p/>
     <w:p>
       <w:pPr>
-        <w:pStyle w:val="Title"/>
+        <w:spacing w:before="40" w:after="40"/>
       </w:pPr>
       <w:r>
-        <w:t>{{ engagement_name }}</w:t>
+        <w:rPr>
+          <w:b/>
+          <w:color w:val="6B7A89"/>
+        </w:rPr>
+        <w:t xml:space="preserve">Client  </w:t>
+      </w:r>
+      <w:r>
+        <w:rPr>
+          <w:color w:val="131B24"/>
+        </w:rPr>
+        <w:t>{{ client_name }}</w:t>
       </w:r>
     </w:p>
     <w:p>
+      <w:pPr>
+        <w:spacing w:before="40" w:after="40"/>
+      </w:pPr>
       <w:r>
         <w:rPr>
           <w:b/>
+          <w:color w:val="6B7A89"/>
+        </w:rPr>
+        <w:t xml:space="preserve">Company  </w:t>
+      </w:r>
+      <w:r>
+        <w:rPr>
+          <w:color w:val="131B24"/>
         </w:rPr>
         <w:t>{{ company_name }}</w:t>
       </w:r>
     </w:p>
     <w:p>
+      <w:pPr>
+        <w:spacing w:before="40" w:after="40"/>
+      </w:pPr>
       <w:r>
-        <w:t>Prepared for {{ client_name }}</w:t>
+        <w:rPr>
+          <w:b/>
+          <w:color w:val="6B7A89"/>
+        </w:rPr>
+        <w:t xml:space="preserve">Scope  </w:t>
+      </w:r>
+      <w:r>
+        <w:rPr>
+          <w:color w:val="131B24"/>
+        </w:rPr>
+        <w:t>{{ scope_type }}</w:t>
       </w:r>
     </w:p>
     <w:p>
+      <w:pPr>
+        <w:spacing w:before="40" w:after="40"/>
+      </w:pPr>
       <w:r>
+        <w:rPr>
+          <w:b/>
+          <w:color w:val="6B7A89"/>
+        </w:rPr>
+        <w:t xml:space="preserve">Assessment window  </w:t>
+      </w:r>
+      <w:r>
+        <w:rPr>
+          <w:color w:val="131B24"/>
+        </w:rPr>
         <w:t>{{ start_date }} – {{ end_date }}</w:t>
       </w:r>
     </w:p>
     <w:p>
+      <w:pPr>
+        <w:spacing w:before="40" w:after="40"/>
+      </w:pPr>
       <w:r>
-        <w:t>Scope: {{ scope_type }}</w:t>
+        <w:rPr>
+          <w:b/>
+          <w:color w:val="6B7A89"/>
+        </w:rPr>
+        <w:t xml:space="preserve">Report generated  </w:t>
+      </w:r>
+      <w:r>
+        <w:rPr>
+          <w:color w:val="131B24"/>
+        </w:rPr>
+        <w:t>{{ generated_date }}</w:t>
       </w:r>
     </w:p>
-    <w:p>
-      <w:r>
-        <w:t>Report generated {{ generated_date }}</w:t>
-      </w:r>
-    </w:p>
+    <w:p/>
     <w:p>
       <w:pPr>
         <w:jc w:val="center"/>
@@ -46,7 +135,7 @@
         <w:rPr>
           <w:b/>
           <w:color w:val="B91C1C"/>
-          <w:sz w:val="28"/>
+          <w:sz w:val="24"/>
         </w:rPr>
         <w:t>CONFIDENTIAL</w:t>
       </w:r>
@@ -59,6 +148,36 @@
     <w:p>
       <w:pPr>
         <w:pStyle w:val="Heading1"/>
+        <w:spacing w:before="80" w:after="120"/>
+        <w:pBdr>
+          <w:bottom w:val="single" w:sz="8" w:space="2" w:color="0F7A52"/>
+        </w:pBdr>
+      </w:pPr>
+      <w:r>
+        <w:t>Table of Contents</w:t>
+      </w:r>
+    </w:p>
+    <w:p>
+      <w:r>
+        <w:fldChar w:fldCharType="begin"/>
+        <w:instrText xml:space="preserve">TOC \o "1-3" \h \z \u</w:instrText>
+        <w:fldChar w:fldCharType="separate"/>
+        <w:t>The table of contents is generated when the report is produced.</w:t>
+        <w:fldChar w:fldCharType="end"/>
+      </w:r>
+    </w:p>
+    <w:p>
+      <w:r>
+        <w:br w:type="page"/>
+      </w:r>
+    </w:p>
+    <w:p>
+      <w:pPr>
+        <w:pStyle w:val="Heading1"/>
+        <w:spacing w:before="80" w:after="120"/>
+        <w:pBdr>
+          <w:bottom w:val="single" w:sz="8" w:space="2" w:color="0F7A52"/>
+        </w:pBdr>
       </w:pPr>
       <w:r>
         <w:t>Executive Summary</w:t>
@@ -69,7 +188,7 @@
         <w:rPr>
           <w:b/>
         </w:rPr>
-        <w:t xml:space="preserve">Overall Risk: </w:t>
+        <w:t xml:space="preserve">Overall risk: </w:t>
       </w:r>
       <w:r>
         <w:t>{% if rollup.overall == "critical" %}</w:t>
@@ -127,7 +246,7 @@
       <w:r>
         <w:rPr>
           <w:b/>
-          <w:color w:val="6B7280"/>
+          <w:color w:val="6B7A89"/>
         </w:rPr>
         <w:t>{{ rollup.overall_label }}</w:t>
       </w:r>
@@ -137,7 +256,7 @@
     </w:p>
     <w:p>
       <w:r>
-        <w:t>{{ groups|length }} section(s), {{ rollup.total }} finding(s) included in this report.</w:t>
+        <w:t>{{ groups|length }} section(s), {{ rollup.total }} finding(s) in this report.</w:t>
       </w:r>
     </w:p>
     <w:p>
@@ -163,11 +282,16 @@
         <w:tc>
           <w:tcPr>
             <w:tcW w:type="dxa" w:w="1440"/>
+            <w:shd w:val="clear" w:color="auto" w:fill="B91C1C"/>
           </w:tcPr>
           <w:p>
+            <w:pPr>
+              <w:jc w:val="center"/>
+            </w:pPr>
             <w:r>
               <w:rPr>
                 <w:b/>
+                <w:color w:val="FFFFFF"/>
               </w:rPr>
               <w:t>Critical</w:t>
             </w:r>
@@ -176,11 +300,16 @@
         <w:tc>
           <w:tcPr>
             <w:tcW w:type="dxa" w:w="1440"/>
+            <w:shd w:val="clear" w:color="auto" w:fill="DC2626"/>
           </w:tcPr>
           <w:p>
+            <w:pPr>
+              <w:jc w:val="center"/>
+            </w:pPr>
             <w:r>
               <w:rPr>
                 <w:b/>
+                <w:color w:val="FFFFFF"/>
               </w:rPr>
               <w:t>High</w:t>
             </w:r>
@@ -189,11 +318,16 @@
         <w:tc>
           <w:tcPr>
             <w:tcW w:type="dxa" w:w="1440"/>
+            <w:shd w:val="clear" w:color="auto" w:fill="EA580C"/>
           </w:tcPr>
           <w:p>
+            <w:pPr>
+              <w:jc w:val="center"/>
+            </w:pPr>
             <w:r>
               <w:rPr>
                 <w:b/>
+                <w:color w:val="FFFFFF"/>
               </w:rPr>
               <w:t>Medium</w:t>
             </w:r>
@@ -202,11 +336,16 @@
         <w:tc>
           <w:tcPr>
             <w:tcW w:type="dxa" w:w="1440"/>
+            <w:shd w:val="clear" w:color="auto" w:fill="CA8A04"/>
           </w:tcPr>
           <w:p>
+            <w:pPr>
+              <w:jc w:val="center"/>
+            </w:pPr>
             <w:r>
               <w:rPr>
                 <w:b/>
+                <w:color w:val="FFFFFF"/>
               </w:rPr>
               <w:t>Low</w:t>
             </w:r>
@@ -215,11 +354,16 @@
         <w:tc>
           <w:tcPr>
             <w:tcW w:type="dxa" w:w="1440"/>
+            <w:shd w:val="clear" w:color="auto" w:fill="0284C7"/>
           </w:tcPr>
           <w:p>
+            <w:pPr>
+              <w:jc w:val="center"/>
+            </w:pPr>
             <w:r>
               <w:rPr>
                 <w:b/>
+                <w:color w:val="FFFFFF"/>
               </w:rPr>
               <w:t>Info</w:t>
             </w:r>
@@ -228,11 +372,16 @@
         <w:tc>
           <w:tcPr>
             <w:tcW w:type="dxa" w:w="1440"/>
+            <w:shd w:val="clear" w:color="auto" w:fill="131B24"/>
           </w:tcPr>
           <w:p>
+            <w:pPr>
+              <w:jc w:val="center"/>
+            </w:pPr>
             <w:r>
               <w:rPr>
                 <w:b/>
+                <w:color w:val="FFFFFF"/>
               </w:rPr>
               <w:t>Total</w:t>
             </w:r>
@@ -245,7 +394,13 @@
             <w:tcW w:type="dxa" w:w="1440"/>
           </w:tcPr>
           <w:p>
+            <w:pPr>
+              <w:jc w:val="center"/>
+            </w:pPr>
             <w:r>
+              <w:rPr>
+                <w:b/>
+              </w:rPr>
               <w:t>{{ rollup.counts.critical }}</w:t>
             </w:r>
           </w:p>
@@ -255,7 +410,13 @@
             <w:tcW w:type="dxa" w:w="1440"/>
           </w:tcPr>
           <w:p>
+            <w:pPr>
+              <w:jc w:val="center"/>
+            </w:pPr>
             <w:r>
+              <w:rPr>
+                <w:b/>
+              </w:rPr>
               <w:t>{{ rollup.counts.high }}</w:t>
             </w:r>
           </w:p>
@@ -265,7 +426,13 @@
             <w:tcW w:type="dxa" w:w="1440"/>
           </w:tcPr>
           <w:p>
+            <w:pPr>
+              <w:jc w:val="center"/>
+            </w:pPr>
             <w:r>
+              <w:rPr>
+                <w:b/>
+              </w:rPr>
               <w:t>{{ rollup.counts.medium }}</w:t>
             </w:r>
           </w:p>
@@ -275,7 +442,13 @@
             <w:tcW w:type="dxa" w:w="1440"/>
           </w:tcPr>
           <w:p>
+            <w:pPr>
+              <w:jc w:val="center"/>
+            </w:pPr>
             <w:r>
+              <w:rPr>
+                <w:b/>
+              </w:rPr>
               <w:t>{{ rollup.counts.low }}</w:t>
             </w:r>
           </w:p>
@@ -285,7 +458,13 @@
             <w:tcW w:type="dxa" w:w="1440"/>
           </w:tcPr>
           <w:p>
+            <w:pPr>
+              <w:jc w:val="center"/>
+            </w:pPr>
             <w:r>
+              <w:rPr>
+                <w:b/>
+              </w:rPr>
               <w:t>{{ rollup.counts.info }}</w:t>
             </w:r>
           </w:p>
@@ -295,7 +474,13 @@
             <w:tcW w:type="dxa" w:w="1440"/>
           </w:tcPr>
           <w:p>
+            <w:pPr>
+              <w:jc w:val="center"/>
+            </w:pPr>
             <w:r>
+              <w:rPr>
+                <w:b/>
+              </w:rPr>
               <w:t>{{ rollup.total }}</w:t>
             </w:r>
           </w:p>
@@ -305,6 +490,18 @@
     <w:p>
       <w:r>
         <w:br w:type="page"/>
+      </w:r>
+    </w:p>
+    <w:p>
+      <w:pPr>
+        <w:pStyle w:val="Heading1"/>
+        <w:spacing w:before="80" w:after="120"/>
+        <w:pBdr>
+          <w:bottom w:val="single" w:sz="8" w:space="2" w:color="0F7A52"/>
+        </w:pBdr>
+      </w:pPr>
+      <w:r>
+        <w:t>Findings</w:t>
       </w:r>
     </w:p>
     <w:p>
@@ -329,7 +526,8 @@
     </w:p>
     <w:p>
       <w:pPr>
-        <w:pStyle w:val="Heading1"/>
+        <w:pStyle w:val="Heading2"/>
+        <w:spacing w:before="160" w:after="80"/>
       </w:pPr>
       <w:r>
         <w:t>{{ group.name }}</w:t>
@@ -357,7 +555,8 @@
     </w:p>
     <w:p>
       <w:pPr>
-        <w:pStyle w:val="Heading2"/>
+        <w:pStyle w:val="Heading3"/>
+        <w:spacing w:before="160" w:after="40"/>
       </w:pPr>
       <w:r>
         <w:t>{{ f.title }}</w:t>
@@ -401,7 +600,7 @@
               <w:t>{% if f.cvss_score %}</w:t>
             </w:r>
             <w:r>
-              <w:t>CVSS: {{ f.cvss_score }}</w:t>
+              <w:t>CVSS {{ f.cvss_score }}</w:t>
             </w:r>
             <w:r>
               <w:t>{% endif %}</w:t>
@@ -417,7 +616,7 @@
               <w:t>{% if f.target %}</w:t>
             </w:r>
             <w:r>
-              <w:t>Target: {{ f.target }}</w:t>
+              <w:t>{{ f.target }}</w:t>
             </w:r>
             <w:r>
               <w:t>{% endif %}</w:t>
@@ -530,6 +729,7 @@
       </w:r>
     </w:p>
     <w:sectPr>
+      <w:footerReference w:type="default" r:id="rId9"/>
       <w:pgSz w:w="12240" w:h="15840"/>
       <w:pgMar w:top="1440" w:right="1800" w:bottom="1440" w:left="1800" w:header="720" w:footer="720" w:gutter="0"/>
       <w:cols w:space="720"/>
@@ -537,6 +737,46 @@
     </w:sectPr>
   </w:body>
 </w:document>
+</file>
+
+<file path=word/footer1.xml><?xml version="1.0" encoding="utf-8"?>
+<w:ftr xmlns:m="http://schemas.openxmlformats.org/officeDocument/2006/math" xmlns:mc="http://schemas.openxmlformats.org/markup-compatibility/2006" xmlns:mo="http://schemas.microsoft.com/office/mac/office/2008/main" xmlns:mv="urn:schemas-microsoft-com:mac:vml" xmlns:o="urn:schemas-microsoft-com:office:office" xmlns:r="http://schemas.openxmlformats.org/officeDocument/2006/relationships" xmlns:v="urn:schemas-microsoft-com:vml" xmlns:w10="urn:schemas-microsoft-com:office:word" xmlns:w14="http://schemas.microsoft.com/office/word/2010/wordml" xmlns:w="http://schemas.openxmlformats.org/wordprocessingml/2006/main" xmlns:wne="http://schemas.microsoft.com/office/word/2006/wordml" xmlns:wp14="http://schemas.microsoft.com/office/word/2010/wordprocessingDrawing" xmlns:wp="http://schemas.openxmlformats.org/drawingml/2006/wordprocessingDrawing" xmlns:wpc="http://schemas.microsoft.com/office/word/2010/wordprocessingCanvas" xmlns:wpg="http://schemas.microsoft.com/office/word/2010/wordprocessingGroup" xmlns:wpi="http://schemas.microsoft.com/office/word/2010/wordprocessingInk" xmlns:wps="http://schemas.microsoft.com/office/word/2010/wordprocessingShape" mc:Ignorable="w14 wp14">
+  <w:p>
+    <w:pPr>
+      <w:pStyle w:val="Footer"/>
+      <w:jc w:val="center"/>
+    </w:pPr>
+    <w:r/>
+    <w:r>
+      <w:rPr>
+        <w:color w:val="6B7A89"/>
+        <w:sz w:val="16"/>
+      </w:rPr>
+      <w:t xml:space="preserve">Page </w:t>
+    </w:r>
+    <w:r>
+      <w:fldChar w:fldCharType="begin"/>
+      <w:instrText xml:space="preserve">PAGE</w:instrText>
+      <w:fldChar w:fldCharType="separate"/>
+      <w:t>1</w:t>
+      <w:fldChar w:fldCharType="end"/>
+    </w:r>
+    <w:r>
+      <w:rPr>
+        <w:color w:val="6B7A89"/>
+        <w:sz w:val="16"/>
+      </w:rPr>
+      <w:t xml:space="preserve"> of </w:t>
+    </w:r>
+    <w:r>
+      <w:fldChar w:fldCharType="begin"/>
+      <w:instrText xml:space="preserve">NUMPAGES</w:instrText>
+      <w:fldChar w:fldCharType="separate"/>
+      <w:t>1</w:t>
+      <w:fldChar w:fldCharType="end"/>
+    </w:r>
+  </w:p>
+</w:ftr>
 </file>
 
 <file path=word/numbering.xml><?xml version="1.0" encoding="utf-8"?>
@@ -902,6 +1142,15 @@
     <w:name w:val="Normal"/>
     <w:qFormat/>
     <w:rsid w:val="00FC693F"/>
+    <w:pPr>
+      <w:spacing w:after="120" w:line="269" w:lineRule="auto"/>
+    </w:pPr>
+    <w:rPr>
+      <w:rFonts w:ascii="Liberation Sans" w:hAnsi="Liberation Sans"/>
+      <w:b w:val="0"/>
+      <w:color w:val="131B24"/>
+      <w:sz w:val="21"/>
+    </w:rPr>
   </w:style>
   <w:style w:type="paragraph" w:styleId="Header">
     <w:name w:val="header"/>
@@ -962,11 +1211,11 @@
       <w:outlineLvl w:val="0"/>
     </w:pPr>
     <w:rPr>
-      <w:rFonts w:asciiTheme="majorHAnsi" w:eastAsiaTheme="majorEastAsia" w:hAnsiTheme="majorHAnsi" w:cstheme="majorBidi"/>
+      <w:rFonts w:asciiTheme="majorHAnsi" w:eastAsiaTheme="majorEastAsia" w:hAnsiTheme="majorHAnsi" w:cstheme="majorBidi" w:ascii="Liberation Sans" w:hAnsi="Liberation Sans"/>
       <w:b/>
       <w:bCs/>
-      <w:color w:val="365F91" w:themeColor="accent1" w:themeShade="BF"/>
-      <w:sz w:val="28"/>
+      <w:color w:val="0A5B3D"/>
+      <w:sz w:val="34"/>
       <w:szCs w:val="28"/>
     </w:rPr>
   </w:style>
@@ -986,10 +1235,10 @@
       <w:outlineLvl w:val="1"/>
     </w:pPr>
     <w:rPr>
-      <w:rFonts w:asciiTheme="majorHAnsi" w:eastAsiaTheme="majorEastAsia" w:hAnsiTheme="majorHAnsi" w:cstheme="majorBidi"/>
+      <w:rFonts w:asciiTheme="majorHAnsi" w:eastAsiaTheme="majorEastAsia" w:hAnsiTheme="majorHAnsi" w:cstheme="majorBidi" w:ascii="Liberation Sans" w:hAnsi="Liberation Sans"/>
       <w:b/>
       <w:bCs/>
-      <w:color w:val="4F81BD" w:themeColor="accent1"/>
+      <w:color w:val="131B24"/>
       <w:sz w:val="26"/>
       <w:szCs w:val="26"/>
     </w:rPr>
@@ -1010,10 +1259,11 @@
       <w:outlineLvl w:val="2"/>
     </w:pPr>
     <w:rPr>
-      <w:rFonts w:asciiTheme="majorHAnsi" w:eastAsiaTheme="majorEastAsia" w:hAnsiTheme="majorHAnsi" w:cstheme="majorBidi"/>
+      <w:rFonts w:asciiTheme="majorHAnsi" w:eastAsiaTheme="majorEastAsia" w:hAnsiTheme="majorHAnsi" w:cstheme="majorBidi" w:ascii="Liberation Sans" w:hAnsi="Liberation Sans"/>
       <w:b/>
       <w:bCs/>
-      <w:color w:val="4F81BD" w:themeColor="accent1"/>
+      <w:color w:val="3D4B59"/>
+      <w:sz w:val="23"/>
     </w:rPr>
   </w:style>
   <w:style w:type="paragraph" w:styleId="Heading4">
@@ -1033,12 +1283,13 @@
       <w:outlineLvl w:val="3"/>
     </w:pPr>
     <w:rPr>
-      <w:rFonts w:asciiTheme="majorHAnsi" w:eastAsiaTheme="majorEastAsia" w:hAnsiTheme="majorHAnsi" w:cstheme="majorBidi"/>
+      <w:rFonts w:asciiTheme="majorHAnsi" w:eastAsiaTheme="majorEastAsia" w:hAnsiTheme="majorHAnsi" w:cstheme="majorBidi" w:ascii="Liberation Sans" w:hAnsi="Liberation Sans"/>
       <w:b/>
       <w:bCs/>
       <w:i/>
       <w:iCs/>
-      <w:color w:val="4F81BD" w:themeColor="accent1"/>
+      <w:color w:val="6B7A89"/>
+      <w:sz w:val="21"/>
     </w:rPr>
   </w:style>
   <w:style w:type="paragraph" w:styleId="Heading5">
@@ -1251,8 +1502,9 @@
       <w:contextualSpacing/>
     </w:pPr>
     <w:rPr>
-      <w:rFonts w:asciiTheme="majorHAnsi" w:eastAsiaTheme="majorEastAsia" w:hAnsiTheme="majorHAnsi" w:cstheme="majorBidi"/>
-      <w:color w:val="17365D" w:themeColor="text2" w:themeShade="BF"/>
+      <w:rFonts w:asciiTheme="majorHAnsi" w:eastAsiaTheme="majorEastAsia" w:hAnsiTheme="majorHAnsi" w:cstheme="majorBidi" w:ascii="Liberation Sans" w:hAnsi="Liberation Sans"/>
+      <w:b/>
+      <w:color w:val="131B24"/>
       <w:spacing w:val="5"/>
       <w:kern w:val="28"/>
       <w:sz w:val="52"/>

</xml_diff>

<commit_message>
feat(scribble): report template as HTML-style cards — severity bar, borders, 0.1in margins, print palette
</commit_message>
<xml_diff>
--- a/scribble/scribble/report_templates/default.docx
+++ b/scribble/scribble/report_templates/default.docx
@@ -5,31 +5,52 @@
     <w:tbl>
       <w:tblPr>
         <w:tblW w:type="auto" w:w="0"/>
-        <w:tblLayout w:type="autofit"/>
+        <w:jc w:val="center"/>
         <w:tblLook w:firstColumn="1" w:firstRow="1" w:lastColumn="0" w:lastRow="0" w:noHBand="0" w:noVBand="1" w:val="04A0"/>
       </w:tblPr>
       <w:tblGrid>
-        <w:gridCol w:w="8640"/>
+        <w:gridCol w:w="11952"/>
       </w:tblGrid>
       <w:tr>
         <w:tc>
           <w:tcPr>
-            <w:tcW w:type="dxa" w:w="8640"/>
+            <w:tcW w:type="dxa" w:w="11952"/>
             <w:shd w:val="clear" w:color="auto" w:fill="0F7A52"/>
-            <w:shd w:val="clear" w:color="auto" w:fill="0F7A52"/>
+            <w:tcMar>
+              <w:top w:w="180" w:type="dxa"/>
+              <w:bottom w:w="180" w:type="dxa"/>
+              <w:left w:w="160" w:type="dxa"/>
+              <w:right w:w="160" w:type="dxa"/>
+            </w:tcMar>
+            <w:tcBorders>
+              <w:top w:val="nil"/>
+              <w:left w:val="nil"/>
+              <w:bottom w:val="nil"/>
+              <w:right w:val="nil"/>
+            </w:tcBorders>
           </w:tcPr>
           <w:p>
-            <w:pPr>
-              <w:spacing w:before="200" w:after="200"/>
-            </w:pPr>
             <w:r>
               <w:rPr>
                 <w:rFonts w:ascii="Liberation Sans" w:hAnsi="Liberation Sans"/>
                 <w:b/>
+                <w:i w:val="0"/>
                 <w:color w:val="FFFFFF"/>
                 <w:sz w:val="48"/>
               </w:rPr>
               <w:t>{{ engagement_name }}</w:t>
+            </w:r>
+          </w:p>
+          <w:p>
+            <w:r>
+              <w:rPr>
+                <w:rFonts w:ascii="Liberation Sans" w:hAnsi="Liberation Sans"/>
+                <w:b w:val="0"/>
+                <w:i w:val="0"/>
+                <w:color w:val="D6EFE3"/>
+                <w:sz w:val="24"/>
+              </w:rPr>
+              <w:t>Security Assessment Report</w:t>
             </w:r>
           </w:p>
         </w:tc>
@@ -38,90 +59,125 @@
     <w:p/>
     <w:p>
       <w:pPr>
-        <w:spacing w:before="40" w:after="40"/>
+        <w:spacing w:before="20" w:after="20"/>
       </w:pPr>
       <w:r>
         <w:rPr>
+          <w:rFonts w:ascii="Liberation Sans" w:hAnsi="Liberation Sans"/>
           <w:b/>
+          <w:i w:val="0"/>
           <w:color w:val="6B7A89"/>
+          <w:sz w:val="20"/>
         </w:rPr>
-        <w:t xml:space="preserve">Client  </w:t>
+        <w:t xml:space="preserve">Client   </w:t>
       </w:r>
       <w:r>
         <w:rPr>
+          <w:rFonts w:ascii="Liberation Sans" w:hAnsi="Liberation Sans"/>
+          <w:b w:val="0"/>
+          <w:i w:val="0"/>
           <w:color w:val="131B24"/>
+          <w:sz w:val="20"/>
         </w:rPr>
         <w:t>{{ client_name }}</w:t>
       </w:r>
     </w:p>
     <w:p>
       <w:pPr>
-        <w:spacing w:before="40" w:after="40"/>
+        <w:spacing w:before="20" w:after="20"/>
       </w:pPr>
       <w:r>
         <w:rPr>
+          <w:rFonts w:ascii="Liberation Sans" w:hAnsi="Liberation Sans"/>
           <w:b/>
+          <w:i w:val="0"/>
           <w:color w:val="6B7A89"/>
+          <w:sz w:val="20"/>
         </w:rPr>
-        <w:t xml:space="preserve">Company  </w:t>
+        <w:t xml:space="preserve">Company   </w:t>
       </w:r>
       <w:r>
         <w:rPr>
+          <w:rFonts w:ascii="Liberation Sans" w:hAnsi="Liberation Sans"/>
+          <w:b w:val="0"/>
+          <w:i w:val="0"/>
           <w:color w:val="131B24"/>
+          <w:sz w:val="20"/>
         </w:rPr>
         <w:t>{{ company_name }}</w:t>
       </w:r>
     </w:p>
     <w:p>
       <w:pPr>
-        <w:spacing w:before="40" w:after="40"/>
+        <w:spacing w:before="20" w:after="20"/>
       </w:pPr>
       <w:r>
         <w:rPr>
+          <w:rFonts w:ascii="Liberation Sans" w:hAnsi="Liberation Sans"/>
           <w:b/>
+          <w:i w:val="0"/>
           <w:color w:val="6B7A89"/>
+          <w:sz w:val="20"/>
         </w:rPr>
-        <w:t xml:space="preserve">Scope  </w:t>
+        <w:t xml:space="preserve">Scope   </w:t>
       </w:r>
       <w:r>
         <w:rPr>
+          <w:rFonts w:ascii="Liberation Sans" w:hAnsi="Liberation Sans"/>
+          <w:b w:val="0"/>
+          <w:i w:val="0"/>
           <w:color w:val="131B24"/>
+          <w:sz w:val="20"/>
         </w:rPr>
         <w:t>{{ scope_type }}</w:t>
       </w:r>
     </w:p>
     <w:p>
       <w:pPr>
-        <w:spacing w:before="40" w:after="40"/>
+        <w:spacing w:before="20" w:after="20"/>
       </w:pPr>
       <w:r>
         <w:rPr>
+          <w:rFonts w:ascii="Liberation Sans" w:hAnsi="Liberation Sans"/>
           <w:b/>
+          <w:i w:val="0"/>
           <w:color w:val="6B7A89"/>
+          <w:sz w:val="20"/>
         </w:rPr>
-        <w:t xml:space="preserve">Assessment window  </w:t>
+        <w:t xml:space="preserve">Assessment window   </w:t>
       </w:r>
       <w:r>
         <w:rPr>
+          <w:rFonts w:ascii="Liberation Sans" w:hAnsi="Liberation Sans"/>
+          <w:b w:val="0"/>
+          <w:i w:val="0"/>
           <w:color w:val="131B24"/>
+          <w:sz w:val="20"/>
         </w:rPr>
         <w:t>{{ start_date }} – {{ end_date }}</w:t>
       </w:r>
     </w:p>
     <w:p>
       <w:pPr>
-        <w:spacing w:before="40" w:after="40"/>
+        <w:spacing w:before="20" w:after="20"/>
       </w:pPr>
       <w:r>
         <w:rPr>
+          <w:rFonts w:ascii="Liberation Sans" w:hAnsi="Liberation Sans"/>
           <w:b/>
+          <w:i w:val="0"/>
           <w:color w:val="6B7A89"/>
+          <w:sz w:val="20"/>
         </w:rPr>
-        <w:t xml:space="preserve">Report generated  </w:t>
+        <w:t xml:space="preserve">Report generated   </w:t>
       </w:r>
       <w:r>
         <w:rPr>
+          <w:rFonts w:ascii="Liberation Sans" w:hAnsi="Liberation Sans"/>
+          <w:b w:val="0"/>
+          <w:i w:val="0"/>
           <w:color w:val="131B24"/>
+          <w:sz w:val="20"/>
         </w:rPr>
         <w:t>{{ generated_date }}</w:t>
       </w:r>
@@ -133,9 +189,13 @@
       </w:pPr>
       <w:r>
         <w:rPr>
+          <w:rFonts w:ascii="Liberation Sans" w:hAnsi="Liberation Sans"/>
           <w:b/>
-          <w:color w:val="B91C1C"/>
-          <w:sz w:val="24"/>
+          <w:i w:val="0"/>
+          <w:color w:val="B3261E"/>
+          <w:sz w:val="22"/>
+          <w:caps w:val="true"/>
+          <w:spacing w:val="8"/>
         </w:rPr>
         <w:t>CONFIDENTIAL</w:t>
       </w:r>
@@ -148,7 +208,7 @@
     <w:p>
       <w:pPr>
         <w:pStyle w:val="Heading1"/>
-        <w:spacing w:before="80" w:after="120"/>
+        <w:spacing w:before="40" w:after="120"/>
         <w:pBdr>
           <w:bottom w:val="single" w:sz="8" w:space="2" w:color="0F7A52"/>
         </w:pBdr>
@@ -174,7 +234,7 @@
     <w:p>
       <w:pPr>
         <w:pStyle w:val="Heading1"/>
-        <w:spacing w:before="80" w:after="120"/>
+        <w:spacing w:before="40" w:after="120"/>
         <w:pBdr>
           <w:bottom w:val="single" w:sz="8" w:space="2" w:color="0F7A52"/>
         </w:pBdr>
@@ -186,7 +246,11 @@
     <w:p>
       <w:r>
         <w:rPr>
+          <w:rFonts w:ascii="Liberation Sans" w:hAnsi="Liberation Sans"/>
           <w:b/>
+          <w:i w:val="0"/>
+          <w:color w:val="131B24"/>
+          <w:sz w:val="21"/>
         </w:rPr>
         <w:t xml:space="preserve">Overall risk: </w:t>
       </w:r>
@@ -195,8 +259,11 @@
       </w:r>
       <w:r>
         <w:rPr>
+          <w:rFonts w:ascii="Liberation Sans" w:hAnsi="Liberation Sans"/>
           <w:b/>
-          <w:color w:val="B91C1C"/>
+          <w:i w:val="0"/>
+          <w:color w:val="B3261E"/>
+          <w:sz w:val="21"/>
         </w:rPr>
         <w:t>{{ rollup.overall_label }}</w:t>
       </w:r>
@@ -205,8 +272,11 @@
       </w:r>
       <w:r>
         <w:rPr>
+          <w:rFonts w:ascii="Liberation Sans" w:hAnsi="Liberation Sans"/>
           <w:b/>
-          <w:color w:val="DC2626"/>
+          <w:i w:val="0"/>
+          <w:color w:val="C2410C"/>
+          <w:sz w:val="21"/>
         </w:rPr>
         <w:t>{{ rollup.overall_label }}</w:t>
       </w:r>
@@ -215,8 +285,11 @@
       </w:r>
       <w:r>
         <w:rPr>
+          <w:rFonts w:ascii="Liberation Sans" w:hAnsi="Liberation Sans"/>
           <w:b/>
-          <w:color w:val="EA580C"/>
+          <w:i w:val="0"/>
+          <w:color w:val="A16207"/>
+          <w:sz w:val="21"/>
         </w:rPr>
         <w:t>{{ rollup.overall_label }}</w:t>
       </w:r>
@@ -225,8 +298,11 @@
       </w:r>
       <w:r>
         <w:rPr>
+          <w:rFonts w:ascii="Liberation Sans" w:hAnsi="Liberation Sans"/>
           <w:b/>
-          <w:color w:val="CA8A04"/>
+          <w:i w:val="0"/>
+          <w:color w:val="1D6FA5"/>
+          <w:sz w:val="21"/>
         </w:rPr>
         <w:t>{{ rollup.overall_label }}</w:t>
       </w:r>
@@ -235,8 +311,11 @@
       </w:r>
       <w:r>
         <w:rPr>
+          <w:rFonts w:ascii="Liberation Sans" w:hAnsi="Liberation Sans"/>
           <w:b/>
-          <w:color w:val="0284C7"/>
+          <w:i w:val="0"/>
+          <w:color w:val="64748B"/>
+          <w:sz w:val="21"/>
         </w:rPr>
         <w:t>{{ rollup.overall_label }}</w:t>
       </w:r>
@@ -245,8 +324,11 @@
       </w:r>
       <w:r>
         <w:rPr>
+          <w:rFonts w:ascii="Liberation Sans" w:hAnsi="Liberation Sans"/>
           <w:b/>
+          <w:i w:val="0"/>
           <w:color w:val="6B7A89"/>
+          <w:sz w:val="21"/>
         </w:rPr>
         <w:t>{{ rollup.overall_label }}</w:t>
       </w:r>
@@ -256,33 +338,53 @@
     </w:p>
     <w:p>
       <w:r>
+        <w:rPr>
+          <w:rFonts w:ascii="Liberation Sans" w:hAnsi="Liberation Sans"/>
+          <w:b w:val="0"/>
+          <w:i w:val="0"/>
+          <w:color w:val="3D4B59"/>
+          <w:sz w:val="21"/>
+        </w:rPr>
         <w:t>{{ groups|length }} section(s), {{ rollup.total }} finding(s) in this report.</w:t>
       </w:r>
     </w:p>
     <w:p>
       <w:r>
+        <w:rPr>
+          <w:rFonts w:ascii="Liberation Sans" w:hAnsi="Liberation Sans"/>
+          <w:b w:val="0"/>
+          <w:i w:val="0"/>
+          <w:color w:val="3D4B59"/>
+          <w:sz w:val="21"/>
+        </w:rPr>
         <w:t>{{ narrative }}</w:t>
       </w:r>
     </w:p>
     <w:tbl>
       <w:tblPr>
-        <w:tblStyle w:val="TableGrid"/>
         <w:tblW w:type="auto" w:w="0"/>
+        <w:jc w:val="left"/>
         <w:tblLook w:firstColumn="1" w:firstRow="1" w:lastColumn="0" w:lastRow="0" w:noHBand="0" w:noVBand="1" w:val="04A0"/>
       </w:tblPr>
       <w:tblGrid>
-        <w:gridCol w:w="1440"/>
-        <w:gridCol w:w="1440"/>
-        <w:gridCol w:w="1440"/>
-        <w:gridCol w:w="1440"/>
-        <w:gridCol w:w="1440"/>
-        <w:gridCol w:w="1440"/>
+        <w:gridCol w:w="1992"/>
+        <w:gridCol w:w="1992"/>
+        <w:gridCol w:w="1992"/>
+        <w:gridCol w:w="1992"/>
+        <w:gridCol w:w="1992"/>
+        <w:gridCol w:w="1992"/>
       </w:tblGrid>
       <w:tr>
         <w:tc>
           <w:tcPr>
-            <w:tcW w:type="dxa" w:w="1440"/>
-            <w:shd w:val="clear" w:color="auto" w:fill="B91C1C"/>
+            <w:tcW w:type="dxa" w:w="1992"/>
+            <w:shd w:val="clear" w:color="auto" w:fill="B3261E"/>
+            <w:tcBorders>
+              <w:top w:val="single" w:sz="6" w:space="0" w:color="E3E8ED"/>
+              <w:left w:val="single" w:sz="6" w:space="0" w:color="E3E8ED"/>
+              <w:bottom w:val="single" w:sz="6" w:space="0" w:color="E3E8ED"/>
+              <w:right w:val="single" w:sz="6" w:space="0" w:color="E3E8ED"/>
+            </w:tcBorders>
           </w:tcPr>
           <w:p>
             <w:pPr>
@@ -290,8 +392,11 @@
             </w:pPr>
             <w:r>
               <w:rPr>
+                <w:rFonts w:ascii="Liberation Sans" w:hAnsi="Liberation Sans"/>
                 <w:b/>
+                <w:i w:val="0"/>
                 <w:color w:val="FFFFFF"/>
+                <w:sz w:val="18"/>
               </w:rPr>
               <w:t>Critical</w:t>
             </w:r>
@@ -299,8 +404,14 @@
         </w:tc>
         <w:tc>
           <w:tcPr>
-            <w:tcW w:type="dxa" w:w="1440"/>
-            <w:shd w:val="clear" w:color="auto" w:fill="DC2626"/>
+            <w:tcW w:type="dxa" w:w="1992"/>
+            <w:shd w:val="clear" w:color="auto" w:fill="C2410C"/>
+            <w:tcBorders>
+              <w:top w:val="single" w:sz="6" w:space="0" w:color="E3E8ED"/>
+              <w:left w:val="single" w:sz="6" w:space="0" w:color="E3E8ED"/>
+              <w:bottom w:val="single" w:sz="6" w:space="0" w:color="E3E8ED"/>
+              <w:right w:val="single" w:sz="6" w:space="0" w:color="E3E8ED"/>
+            </w:tcBorders>
           </w:tcPr>
           <w:p>
             <w:pPr>
@@ -308,8 +419,11 @@
             </w:pPr>
             <w:r>
               <w:rPr>
+                <w:rFonts w:ascii="Liberation Sans" w:hAnsi="Liberation Sans"/>
                 <w:b/>
+                <w:i w:val="0"/>
                 <w:color w:val="FFFFFF"/>
+                <w:sz w:val="18"/>
               </w:rPr>
               <w:t>High</w:t>
             </w:r>
@@ -317,8 +431,14 @@
         </w:tc>
         <w:tc>
           <w:tcPr>
-            <w:tcW w:type="dxa" w:w="1440"/>
-            <w:shd w:val="clear" w:color="auto" w:fill="EA580C"/>
+            <w:tcW w:type="dxa" w:w="1992"/>
+            <w:shd w:val="clear" w:color="auto" w:fill="A16207"/>
+            <w:tcBorders>
+              <w:top w:val="single" w:sz="6" w:space="0" w:color="E3E8ED"/>
+              <w:left w:val="single" w:sz="6" w:space="0" w:color="E3E8ED"/>
+              <w:bottom w:val="single" w:sz="6" w:space="0" w:color="E3E8ED"/>
+              <w:right w:val="single" w:sz="6" w:space="0" w:color="E3E8ED"/>
+            </w:tcBorders>
           </w:tcPr>
           <w:p>
             <w:pPr>
@@ -326,8 +446,11 @@
             </w:pPr>
             <w:r>
               <w:rPr>
+                <w:rFonts w:ascii="Liberation Sans" w:hAnsi="Liberation Sans"/>
                 <w:b/>
+                <w:i w:val="0"/>
                 <w:color w:val="FFFFFF"/>
+                <w:sz w:val="18"/>
               </w:rPr>
               <w:t>Medium</w:t>
             </w:r>
@@ -335,8 +458,14 @@
         </w:tc>
         <w:tc>
           <w:tcPr>
-            <w:tcW w:type="dxa" w:w="1440"/>
-            <w:shd w:val="clear" w:color="auto" w:fill="CA8A04"/>
+            <w:tcW w:type="dxa" w:w="1992"/>
+            <w:shd w:val="clear" w:color="auto" w:fill="1D6FA5"/>
+            <w:tcBorders>
+              <w:top w:val="single" w:sz="6" w:space="0" w:color="E3E8ED"/>
+              <w:left w:val="single" w:sz="6" w:space="0" w:color="E3E8ED"/>
+              <w:bottom w:val="single" w:sz="6" w:space="0" w:color="E3E8ED"/>
+              <w:right w:val="single" w:sz="6" w:space="0" w:color="E3E8ED"/>
+            </w:tcBorders>
           </w:tcPr>
           <w:p>
             <w:pPr>
@@ -344,8 +473,11 @@
             </w:pPr>
             <w:r>
               <w:rPr>
+                <w:rFonts w:ascii="Liberation Sans" w:hAnsi="Liberation Sans"/>
                 <w:b/>
+                <w:i w:val="0"/>
                 <w:color w:val="FFFFFF"/>
+                <w:sz w:val="18"/>
               </w:rPr>
               <w:t>Low</w:t>
             </w:r>
@@ -353,8 +485,14 @@
         </w:tc>
         <w:tc>
           <w:tcPr>
-            <w:tcW w:type="dxa" w:w="1440"/>
-            <w:shd w:val="clear" w:color="auto" w:fill="0284C7"/>
+            <w:tcW w:type="dxa" w:w="1992"/>
+            <w:shd w:val="clear" w:color="auto" w:fill="64748B"/>
+            <w:tcBorders>
+              <w:top w:val="single" w:sz="6" w:space="0" w:color="E3E8ED"/>
+              <w:left w:val="single" w:sz="6" w:space="0" w:color="E3E8ED"/>
+              <w:bottom w:val="single" w:sz="6" w:space="0" w:color="E3E8ED"/>
+              <w:right w:val="single" w:sz="6" w:space="0" w:color="E3E8ED"/>
+            </w:tcBorders>
           </w:tcPr>
           <w:p>
             <w:pPr>
@@ -362,8 +500,11 @@
             </w:pPr>
             <w:r>
               <w:rPr>
+                <w:rFonts w:ascii="Liberation Sans" w:hAnsi="Liberation Sans"/>
                 <w:b/>
+                <w:i w:val="0"/>
                 <w:color w:val="FFFFFF"/>
+                <w:sz w:val="18"/>
               </w:rPr>
               <w:t>Info</w:t>
             </w:r>
@@ -371,8 +512,14 @@
         </w:tc>
         <w:tc>
           <w:tcPr>
-            <w:tcW w:type="dxa" w:w="1440"/>
+            <w:tcW w:type="dxa" w:w="1992"/>
             <w:shd w:val="clear" w:color="auto" w:fill="131B24"/>
+            <w:tcBorders>
+              <w:top w:val="single" w:sz="6" w:space="0" w:color="E3E8ED"/>
+              <w:left w:val="single" w:sz="6" w:space="0" w:color="E3E8ED"/>
+              <w:bottom w:val="single" w:sz="6" w:space="0" w:color="E3E8ED"/>
+              <w:right w:val="single" w:sz="6" w:space="0" w:color="E3E8ED"/>
+            </w:tcBorders>
           </w:tcPr>
           <w:p>
             <w:pPr>
@@ -380,8 +527,11 @@
             </w:pPr>
             <w:r>
               <w:rPr>
+                <w:rFonts w:ascii="Liberation Sans" w:hAnsi="Liberation Sans"/>
                 <w:b/>
+                <w:i w:val="0"/>
                 <w:color w:val="FFFFFF"/>
+                <w:sz w:val="18"/>
               </w:rPr>
               <w:t>Total</w:t>
             </w:r>
@@ -391,7 +541,13 @@
       <w:tr>
         <w:tc>
           <w:tcPr>
-            <w:tcW w:type="dxa" w:w="1440"/>
+            <w:tcW w:type="dxa" w:w="1992"/>
+            <w:tcBorders>
+              <w:top w:val="single" w:sz="6" w:space="0" w:color="E3E8ED"/>
+              <w:left w:val="single" w:sz="6" w:space="0" w:color="E3E8ED"/>
+              <w:bottom w:val="single" w:sz="6" w:space="0" w:color="E3E8ED"/>
+              <w:right w:val="single" w:sz="6" w:space="0" w:color="E3E8ED"/>
+            </w:tcBorders>
           </w:tcPr>
           <w:p>
             <w:pPr>
@@ -399,7 +555,11 @@
             </w:pPr>
             <w:r>
               <w:rPr>
+                <w:rFonts w:ascii="Liberation Sans" w:hAnsi="Liberation Sans"/>
                 <w:b/>
+                <w:i w:val="0"/>
+                <w:color w:val="131B24"/>
+                <w:sz w:val="21"/>
               </w:rPr>
               <w:t>{{ rollup.counts.critical }}</w:t>
             </w:r>
@@ -407,7 +567,13 @@
         </w:tc>
         <w:tc>
           <w:tcPr>
-            <w:tcW w:type="dxa" w:w="1440"/>
+            <w:tcW w:type="dxa" w:w="1992"/>
+            <w:tcBorders>
+              <w:top w:val="single" w:sz="6" w:space="0" w:color="E3E8ED"/>
+              <w:left w:val="single" w:sz="6" w:space="0" w:color="E3E8ED"/>
+              <w:bottom w:val="single" w:sz="6" w:space="0" w:color="E3E8ED"/>
+              <w:right w:val="single" w:sz="6" w:space="0" w:color="E3E8ED"/>
+            </w:tcBorders>
           </w:tcPr>
           <w:p>
             <w:pPr>
@@ -415,7 +581,11 @@
             </w:pPr>
             <w:r>
               <w:rPr>
+                <w:rFonts w:ascii="Liberation Sans" w:hAnsi="Liberation Sans"/>
                 <w:b/>
+                <w:i w:val="0"/>
+                <w:color w:val="131B24"/>
+                <w:sz w:val="21"/>
               </w:rPr>
               <w:t>{{ rollup.counts.high }}</w:t>
             </w:r>
@@ -423,7 +593,13 @@
         </w:tc>
         <w:tc>
           <w:tcPr>
-            <w:tcW w:type="dxa" w:w="1440"/>
+            <w:tcW w:type="dxa" w:w="1992"/>
+            <w:tcBorders>
+              <w:top w:val="single" w:sz="6" w:space="0" w:color="E3E8ED"/>
+              <w:left w:val="single" w:sz="6" w:space="0" w:color="E3E8ED"/>
+              <w:bottom w:val="single" w:sz="6" w:space="0" w:color="E3E8ED"/>
+              <w:right w:val="single" w:sz="6" w:space="0" w:color="E3E8ED"/>
+            </w:tcBorders>
           </w:tcPr>
           <w:p>
             <w:pPr>
@@ -431,7 +607,11 @@
             </w:pPr>
             <w:r>
               <w:rPr>
+                <w:rFonts w:ascii="Liberation Sans" w:hAnsi="Liberation Sans"/>
                 <w:b/>
+                <w:i w:val="0"/>
+                <w:color w:val="131B24"/>
+                <w:sz w:val="21"/>
               </w:rPr>
               <w:t>{{ rollup.counts.medium }}</w:t>
             </w:r>
@@ -439,7 +619,13 @@
         </w:tc>
         <w:tc>
           <w:tcPr>
-            <w:tcW w:type="dxa" w:w="1440"/>
+            <w:tcW w:type="dxa" w:w="1992"/>
+            <w:tcBorders>
+              <w:top w:val="single" w:sz="6" w:space="0" w:color="E3E8ED"/>
+              <w:left w:val="single" w:sz="6" w:space="0" w:color="E3E8ED"/>
+              <w:bottom w:val="single" w:sz="6" w:space="0" w:color="E3E8ED"/>
+              <w:right w:val="single" w:sz="6" w:space="0" w:color="E3E8ED"/>
+            </w:tcBorders>
           </w:tcPr>
           <w:p>
             <w:pPr>
@@ -447,7 +633,11 @@
             </w:pPr>
             <w:r>
               <w:rPr>
+                <w:rFonts w:ascii="Liberation Sans" w:hAnsi="Liberation Sans"/>
                 <w:b/>
+                <w:i w:val="0"/>
+                <w:color w:val="131B24"/>
+                <w:sz w:val="21"/>
               </w:rPr>
               <w:t>{{ rollup.counts.low }}</w:t>
             </w:r>
@@ -455,7 +645,13 @@
         </w:tc>
         <w:tc>
           <w:tcPr>
-            <w:tcW w:type="dxa" w:w="1440"/>
+            <w:tcW w:type="dxa" w:w="1992"/>
+            <w:tcBorders>
+              <w:top w:val="single" w:sz="6" w:space="0" w:color="E3E8ED"/>
+              <w:left w:val="single" w:sz="6" w:space="0" w:color="E3E8ED"/>
+              <w:bottom w:val="single" w:sz="6" w:space="0" w:color="E3E8ED"/>
+              <w:right w:val="single" w:sz="6" w:space="0" w:color="E3E8ED"/>
+            </w:tcBorders>
           </w:tcPr>
           <w:p>
             <w:pPr>
@@ -463,7 +659,11 @@
             </w:pPr>
             <w:r>
               <w:rPr>
+                <w:rFonts w:ascii="Liberation Sans" w:hAnsi="Liberation Sans"/>
                 <w:b/>
+                <w:i w:val="0"/>
+                <w:color w:val="131B24"/>
+                <w:sz w:val="21"/>
               </w:rPr>
               <w:t>{{ rollup.counts.info }}</w:t>
             </w:r>
@@ -471,7 +671,13 @@
         </w:tc>
         <w:tc>
           <w:tcPr>
-            <w:tcW w:type="dxa" w:w="1440"/>
+            <w:tcW w:type="dxa" w:w="1992"/>
+            <w:tcBorders>
+              <w:top w:val="single" w:sz="6" w:space="0" w:color="E3E8ED"/>
+              <w:left w:val="single" w:sz="6" w:space="0" w:color="E3E8ED"/>
+              <w:bottom w:val="single" w:sz="6" w:space="0" w:color="E3E8ED"/>
+              <w:right w:val="single" w:sz="6" w:space="0" w:color="E3E8ED"/>
+            </w:tcBorders>
           </w:tcPr>
           <w:p>
             <w:pPr>
@@ -479,7 +685,11 @@
             </w:pPr>
             <w:r>
               <w:rPr>
+                <w:rFonts w:ascii="Liberation Sans" w:hAnsi="Liberation Sans"/>
                 <w:b/>
+                <w:i w:val="0"/>
+                <w:color w:val="131B24"/>
+                <w:sz w:val="21"/>
               </w:rPr>
               <w:t>{{ rollup.total }}</w:t>
             </w:r>
@@ -495,7 +705,7 @@
     <w:p>
       <w:pPr>
         <w:pStyle w:val="Heading1"/>
-        <w:spacing w:before="80" w:after="120"/>
+        <w:spacing w:before="40" w:after="120"/>
         <w:pBdr>
           <w:bottom w:val="single" w:sz="8" w:space="2" w:color="0F7A52"/>
         </w:pBdr>
@@ -553,71 +763,313 @@
         <w:t>{% for f in group.findings %}</w:t>
       </w:r>
     </w:p>
-    <w:p>
-      <w:pPr>
-        <w:pStyle w:val="Heading3"/>
-        <w:spacing w:before="160" w:after="40"/>
-      </w:pPr>
-      <w:r>
-        <w:t>{{ f.title }}</w:t>
-      </w:r>
-    </w:p>
     <w:tbl>
       <w:tblPr>
-        <w:tblStyle w:val="TableGrid"/>
         <w:tblW w:type="auto" w:w="0"/>
+        <w:jc w:val="left"/>
+        <w:tblLayout w:type="fixed"/>
         <w:tblLook w:firstColumn="1" w:firstRow="1" w:lastColumn="0" w:lastRow="0" w:noHBand="0" w:noVBand="1" w:val="04A0"/>
+        <w:tblLayout w:type="fixed"/>
+        <w:tblW w:w="11793" w:type="dxa"/>
       </w:tblPr>
       <w:tblGrid>
-        <w:gridCol w:w="2880"/>
-        <w:gridCol w:w="2880"/>
-        <w:gridCol w:w="2880"/>
+        <w:gridCol w:w="129"/>
+        <w:gridCol w:w="11664"/>
       </w:tblGrid>
       <w:tr>
         <w:tc>
           <w:tcPr>
-            <w:tcW w:type="dxa" w:w="2880"/>
+            <w:tcW w:type="dxa" w:w="130"/>
+            <w:tcBorders>
+              <w:top w:val="single" w:sz="6" w:space="0" w:color="E3E8ED"/>
+              <w:left w:val="single" w:sz="6" w:space="0" w:color="E3E8ED"/>
+              <w:bottom w:val="single" w:sz="6" w:space="0" w:color="E3E8ED"/>
+            </w:tcBorders>
+            <w:tcMar>
+              <w:top w:w="0" w:type="dxa"/>
+              <w:bottom w:w="0" w:type="dxa"/>
+              <w:left w:w="0" w:type="dxa"/>
+              <w:right w:w="0" w:type="dxa"/>
+            </w:tcMar>
           </w:tcPr>
           <w:p>
             <w:r>
-              <w:t>{% cellbg ("B91C1C" if f.severity == "critical" else ("DC2626" if f.severity == "high" else ("EA580C" if f.severity == "medium" else ("CA8A04" if f.severity == "low" else "0284C7")))) %}</w:t>
-            </w:r>
-            <w:r>
-              <w:rPr>
-                <w:b/>
-                <w:color w:val="FFFFFF"/>
-              </w:rPr>
-              <w:t>{{ f.severity_label }}</w:t>
+              <w:t>{% cellbg ("B3261E" if f.severity == "critical" else ("C2410C" if f.severity == "high" else ("A16207" if f.severity == "medium" else ("1D6FA5" if f.severity == "low" else "64748B")))) %}</w:t>
             </w:r>
           </w:p>
         </w:tc>
         <w:tc>
           <w:tcPr>
-            <w:tcW w:type="dxa" w:w="2880"/>
+            <w:tcW w:type="dxa" w:w="11664"/>
+            <w:tcBorders>
+              <w:top w:val="single" w:sz="6" w:space="0" w:color="E3E8ED"/>
+              <w:right w:val="single" w:sz="6" w:space="0" w:color="E3E8ED"/>
+              <w:bottom w:val="single" w:sz="6" w:space="0" w:color="E3E8ED"/>
+            </w:tcBorders>
+            <w:tcMar>
+              <w:top w:w="110" w:type="dxa"/>
+              <w:bottom w:w="110" w:type="dxa"/>
+              <w:left w:w="160" w:type="dxa"/>
+              <w:right w:w="160" w:type="dxa"/>
+            </w:tcMar>
           </w:tcPr>
           <w:p>
+            <w:pPr>
+              <w:pStyle w:val="Heading3"/>
+              <w:spacing w:before="0" w:after="40"/>
+            </w:pPr>
+            <w:r>
+              <w:rPr>
+                <w:rFonts w:ascii="Liberation Sans" w:hAnsi="Liberation Sans"/>
+                <w:b/>
+                <w:i w:val="0"/>
+                <w:color w:val="131B24"/>
+                <w:sz w:val="26"/>
+              </w:rPr>
+              <w:t>{{ f.title }}</w:t>
+            </w:r>
+          </w:p>
+          <w:p>
+            <w:pPr>
+              <w:spacing w:before="0" w:after="80"/>
+            </w:pPr>
+            <w:r>
+              <w:t>{% if f.severity == "critical" %}</w:t>
+            </w:r>
+            <w:r>
+              <w:rPr>
+                <w:rFonts w:ascii="Liberation Sans" w:hAnsi="Liberation Sans"/>
+                <w:b/>
+                <w:i w:val="0"/>
+                <w:color w:val="B3261E"/>
+                <w:sz w:val="18"/>
+                <w:caps w:val="true"/>
+                <w:spacing w:val="8"/>
+              </w:rPr>
+              <w:t>{{ f.severity_label }}</w:t>
+            </w:r>
+            <w:r>
+              <w:t>{% elif f.severity == "high" %}</w:t>
+            </w:r>
+            <w:r>
+              <w:rPr>
+                <w:rFonts w:ascii="Liberation Sans" w:hAnsi="Liberation Sans"/>
+                <w:b/>
+                <w:i w:val="0"/>
+                <w:color w:val="C2410C"/>
+                <w:sz w:val="18"/>
+                <w:caps w:val="true"/>
+                <w:spacing w:val="8"/>
+              </w:rPr>
+              <w:t>{{ f.severity_label }}</w:t>
+            </w:r>
+            <w:r>
+              <w:t>{% elif f.severity == "medium" %}</w:t>
+            </w:r>
+            <w:r>
+              <w:rPr>
+                <w:rFonts w:ascii="Liberation Sans" w:hAnsi="Liberation Sans"/>
+                <w:b/>
+                <w:i w:val="0"/>
+                <w:color w:val="A16207"/>
+                <w:sz w:val="18"/>
+                <w:caps w:val="true"/>
+                <w:spacing w:val="8"/>
+              </w:rPr>
+              <w:t>{{ f.severity_label }}</w:t>
+            </w:r>
+            <w:r>
+              <w:t>{% elif f.severity == "low" %}</w:t>
+            </w:r>
+            <w:r>
+              <w:rPr>
+                <w:rFonts w:ascii="Liberation Sans" w:hAnsi="Liberation Sans"/>
+                <w:b/>
+                <w:i w:val="0"/>
+                <w:color w:val="1D6FA5"/>
+                <w:sz w:val="18"/>
+                <w:caps w:val="true"/>
+                <w:spacing w:val="8"/>
+              </w:rPr>
+              <w:t>{{ f.severity_label }}</w:t>
+            </w:r>
+            <w:r>
+              <w:t>{% elif f.severity == "info" %}</w:t>
+            </w:r>
+            <w:r>
+              <w:rPr>
+                <w:rFonts w:ascii="Liberation Sans" w:hAnsi="Liberation Sans"/>
+                <w:b/>
+                <w:i w:val="0"/>
+                <w:color w:val="64748B"/>
+                <w:sz w:val="18"/>
+                <w:caps w:val="true"/>
+                <w:spacing w:val="8"/>
+              </w:rPr>
+              <w:t>{{ f.severity_label }}</w:t>
+            </w:r>
+            <w:r>
+              <w:t>{% else %}</w:t>
+            </w:r>
+            <w:r>
+              <w:rPr>
+                <w:rFonts w:ascii="Liberation Sans" w:hAnsi="Liberation Sans"/>
+                <w:b/>
+                <w:i w:val="0"/>
+                <w:color w:val="6B7A89"/>
+                <w:sz w:val="18"/>
+                <w:caps w:val="true"/>
+                <w:spacing w:val="8"/>
+              </w:rPr>
+              <w:t>{{ f.severity_label }}</w:t>
+            </w:r>
+            <w:r>
+              <w:t>{% endif %}</w:t>
+            </w:r>
             <w:r>
               <w:t>{% if f.cvss_score %}</w:t>
             </w:r>
             <w:r>
-              <w:t>CVSS {{ f.cvss_score }}</w:t>
+              <w:rPr>
+                <w:rFonts w:ascii="Liberation Sans" w:hAnsi="Liberation Sans"/>
+                <w:b/>
+                <w:i w:val="0"/>
+                <w:color w:val="3D4B59"/>
+                <w:sz w:val="18"/>
+              </w:rPr>
+              <w:t xml:space="preserve">    CVSS {{ f.cvss_score }}</w:t>
+            </w:r>
+            <w:r>
+              <w:t>{% endif %}</w:t>
+            </w:r>
+            <w:r>
+              <w:t>{% if f.target %}</w:t>
+            </w:r>
+            <w:r>
+              <w:rPr>
+                <w:rFonts w:ascii="DejaVu Sans Mono" w:hAnsi="DejaVu Sans Mono"/>
+                <w:b w:val="0"/>
+                <w:i w:val="0"/>
+                <w:color w:val="6B7A89"/>
+                <w:sz w:val="18"/>
+              </w:rPr>
+              <w:t xml:space="preserve">    {{ f.target }}</w:t>
             </w:r>
             <w:r>
               <w:t>{% endif %}</w:t>
             </w:r>
           </w:p>
-        </w:tc>
-        <w:tc>
-          <w:tcPr>
-            <w:tcW w:type="dxa" w:w="2880"/>
-          </w:tcPr>
           <w:p>
             <w:r>
-              <w:t>{% if f.target %}</w:t>
+              <w:t>{% if f.status_label %}</w:t>
+            </w:r>
+          </w:p>
+          <w:p>
+            <w:r>
+              <w:rPr>
+                <w:rFonts w:ascii="Liberation Sans" w:hAnsi="Liberation Sans"/>
+                <w:b w:val="0"/>
+                <w:i/>
+                <w:color w:val="6B7A89"/>
+                <w:sz w:val="18"/>
+              </w:rPr>
+              <w:t xml:space="preserve">Status: </w:t>
             </w:r>
             <w:r>
-              <w:t>{{ f.target }}</w:t>
+              <w:rPr>
+                <w:rFonts w:ascii="Liberation Sans" w:hAnsi="Liberation Sans"/>
+                <w:b/>
+                <w:i w:val="0"/>
+                <w:color w:val="131B24"/>
+                <w:sz w:val="18"/>
+              </w:rPr>
+              <w:t>{{ f.status_label }}</w:t>
             </w:r>
+          </w:p>
+          <w:p>
+            <w:r>
+              <w:t>{% endif %}</w:t>
+            </w:r>
+          </w:p>
+          <w:p>
+            <w:r>
+              <w:t>{{r f.body }}</w:t>
+            </w:r>
+          </w:p>
+          <w:p>
+            <w:r>
+              <w:t>{% if f.artifacts %}</w:t>
+            </w:r>
+          </w:p>
+          <w:p>
+            <w:r>
+              <w:rPr>
+                <w:rFonts w:ascii="Liberation Sans" w:hAnsi="Liberation Sans"/>
+                <w:b/>
+                <w:i w:val="0"/>
+                <w:color w:val="0A5B3D"/>
+                <w:sz w:val="18"/>
+                <w:caps w:val="true"/>
+                <w:spacing w:val="8"/>
+              </w:rPr>
+              <w:t>Evidence</w:t>
+            </w:r>
+          </w:p>
+          <w:p>
+            <w:r>
+              <w:t>{% for a in f.artifacts %}</w:t>
+            </w:r>
+          </w:p>
+          <w:p>
+            <w:r>
+              <w:t>{% if a.embedded %}</w:t>
+            </w:r>
+          </w:p>
+          <w:p>
+            <w:r>
+              <w:t>{{ a.image }}</w:t>
+            </w:r>
+          </w:p>
+          <w:p>
+            <w:r>
+              <w:rPr>
+                <w:rFonts w:ascii="Liberation Sans" w:hAnsi="Liberation Sans"/>
+                <w:b w:val="0"/>
+                <w:i/>
+                <w:color w:val="6B7A89"/>
+                <w:sz w:val="16"/>
+              </w:rPr>
+              <w:t>{{ a.caption }}</w:t>
+            </w:r>
+          </w:p>
+          <w:p>
+            <w:r>
+              <w:t>{% else %}</w:t>
+            </w:r>
+          </w:p>
+          <w:p>
+            <w:r>
+              <w:rPr>
+                <w:rFonts w:ascii="Liberation Sans" w:hAnsi="Liberation Sans"/>
+                <w:b w:val="0"/>
+                <w:i/>
+                <w:color w:val="6B7A89"/>
+                <w:sz w:val="16"/>
+              </w:rPr>
+              <w:t>📄 {{ a.filename }} — {{ a.caption }} (not embedded)</w:t>
+            </w:r>
+          </w:p>
+          <w:p>
+            <w:r>
+              <w:t>{% endif %}</w:t>
+            </w:r>
+          </w:p>
+          <w:p>
+            <w:r>
+              <w:t>{% endfor %}</w:t>
+            </w:r>
+          </w:p>
+          <w:p>
             <w:r>
               <w:t>{% endif %}</w:t>
             </w:r>
@@ -625,99 +1077,7 @@
         </w:tc>
       </w:tr>
     </w:tbl>
-    <w:p>
-      <w:r>
-        <w:t>{% if f.status_label %}</w:t>
-      </w:r>
-    </w:p>
-    <w:p>
-      <w:r>
-        <w:rPr>
-          <w:i/>
-        </w:rPr>
-        <w:t xml:space="preserve">Status: </w:t>
-      </w:r>
-      <w:r>
-        <w:rPr>
-          <w:b/>
-        </w:rPr>
-        <w:t>{{ f.status_label }}</w:t>
-      </w:r>
-    </w:p>
-    <w:p>
-      <w:r>
-        <w:t>{% endif %}</w:t>
-      </w:r>
-    </w:p>
-    <w:p>
-      <w:r>
-        <w:t>{{r f.body }}</w:t>
-      </w:r>
-    </w:p>
-    <w:p>
-      <w:r>
-        <w:t>{% if f.artifacts %}</w:t>
-      </w:r>
-    </w:p>
-    <w:p>
-      <w:pPr>
-        <w:pStyle w:val="Heading4"/>
-      </w:pPr>
-      <w:r>
-        <w:t>Evidence</w:t>
-      </w:r>
-    </w:p>
-    <w:p>
-      <w:r>
-        <w:t>{% for a in f.artifacts %}</w:t>
-      </w:r>
-    </w:p>
-    <w:p>
-      <w:r>
-        <w:t>{% if a.embedded %}</w:t>
-      </w:r>
-    </w:p>
-    <w:p>
-      <w:r>
-        <w:t>{{ a.image }}</w:t>
-      </w:r>
-    </w:p>
-    <w:p>
-      <w:r>
-        <w:rPr>
-          <w:i/>
-        </w:rPr>
-        <w:t>{{ a.caption }}</w:t>
-      </w:r>
-    </w:p>
-    <w:p>
-      <w:r>
-        <w:t>{% else %}</w:t>
-      </w:r>
-    </w:p>
-    <w:p>
-      <w:r>
-        <w:rPr>
-          <w:i/>
-        </w:rPr>
-        <w:t>📄 {{ a.filename }} — {{ a.caption }} (not embedded)</w:t>
-      </w:r>
-    </w:p>
-    <w:p>
-      <w:r>
-        <w:t>{% endif %}</w:t>
-      </w:r>
-    </w:p>
-    <w:p>
-      <w:r>
-        <w:t>{% endfor %}</w:t>
-      </w:r>
-    </w:p>
-    <w:p>
-      <w:r>
-        <w:t>{% endif %}</w:t>
-      </w:r>
-    </w:p>
+    <w:p/>
     <w:p>
       <w:r>
         <w:t>{% endfor %}</w:t>
@@ -731,7 +1091,7 @@
     <w:sectPr>
       <w:footerReference w:type="default" r:id="rId9"/>
       <w:pgSz w:w="12240" w:h="15840"/>
-      <w:pgMar w:top="1440" w:right="1800" w:bottom="1440" w:left="1800" w:header="720" w:footer="720" w:gutter="0"/>
+      <w:pgMar w:top="504" w:right="144" w:bottom="648" w:left="144" w:header="720" w:footer="259" w:gutter="0"/>
       <w:cols w:space="720"/>
       <w:docGrid w:linePitch="360"/>
     </w:sectPr>
@@ -749,6 +1109,9 @@
     <w:r/>
     <w:r>
       <w:rPr>
+        <w:rFonts w:ascii="Liberation Sans" w:hAnsi="Liberation Sans"/>
+        <w:b w:val="0"/>
+        <w:i w:val="0"/>
         <w:color w:val="6B7A89"/>
         <w:sz w:val="16"/>
       </w:rPr>
@@ -763,6 +1126,9 @@
     </w:r>
     <w:r>
       <w:rPr>
+        <w:rFonts w:ascii="Liberation Sans" w:hAnsi="Liberation Sans"/>
+        <w:b w:val="0"/>
+        <w:i w:val="0"/>
         <w:color w:val="6B7A89"/>
         <w:sz w:val="16"/>
       </w:rPr>
@@ -1143,13 +1509,14 @@
     <w:qFormat/>
     <w:rsid w:val="00FC693F"/>
     <w:pPr>
-      <w:spacing w:after="120" w:line="269" w:lineRule="auto"/>
+      <w:spacing w:after="100" w:line="269" w:lineRule="auto"/>
     </w:pPr>
     <w:rPr>
       <w:rFonts w:ascii="Liberation Sans" w:hAnsi="Liberation Sans"/>
       <w:b w:val="0"/>
       <w:color w:val="131B24"/>
-      <w:sz w:val="21"/>
+      <w:sz w:val="20"/>
+      <w:rFonts w:ascii="Liberation Sans" w:hAnsi="Liberation Sans"/>
     </w:rPr>
   </w:style>
   <w:style w:type="paragraph" w:styleId="Header">
@@ -1215,8 +1582,9 @@
       <w:b/>
       <w:bCs/>
       <w:color w:val="0A5B3D"/>
-      <w:sz w:val="34"/>
+      <w:sz w:val="32"/>
       <w:szCs w:val="28"/>
+      <w:rFonts w:ascii="Liberation Sans" w:hAnsi="Liberation Sans"/>
     </w:rPr>
   </w:style>
   <w:style w:type="paragraph" w:styleId="Heading2">
@@ -1239,8 +1607,9 @@
       <w:b/>
       <w:bCs/>
       <w:color w:val="131B24"/>
-      <w:sz w:val="26"/>
+      <w:sz w:val="25"/>
       <w:szCs w:val="26"/>
+      <w:rFonts w:ascii="Liberation Sans" w:hAnsi="Liberation Sans"/>
     </w:rPr>
   </w:style>
   <w:style w:type="paragraph" w:styleId="Heading3">
@@ -1262,8 +1631,9 @@
       <w:rFonts w:asciiTheme="majorHAnsi" w:eastAsiaTheme="majorEastAsia" w:hAnsiTheme="majorHAnsi" w:cstheme="majorBidi" w:ascii="Liberation Sans" w:hAnsi="Liberation Sans"/>
       <w:b/>
       <w:bCs/>
-      <w:color w:val="3D4B59"/>
-      <w:sz w:val="23"/>
+      <w:color w:val="131B24"/>
+      <w:sz w:val="22"/>
+      <w:rFonts w:ascii="Liberation Sans" w:hAnsi="Liberation Sans"/>
     </w:rPr>
   </w:style>
   <w:style w:type="paragraph" w:styleId="Heading4">
@@ -1288,8 +1658,9 @@
       <w:bCs/>
       <w:i/>
       <w:iCs/>
-      <w:color w:val="6B7A89"/>
-      <w:sz w:val="21"/>
+      <w:color w:val="0A5B3D"/>
+      <w:sz w:val="18"/>
+      <w:rFonts w:ascii="Liberation Sans" w:hAnsi="Liberation Sans"/>
     </w:rPr>
   </w:style>
   <w:style w:type="paragraph" w:styleId="Heading5">
@@ -1509,6 +1880,7 @@
       <w:kern w:val="28"/>
       <w:sz w:val="52"/>
       <w:szCs w:val="52"/>
+      <w:rFonts w:ascii="Liberation Sans" w:hAnsi="Liberation Sans"/>
     </w:rPr>
   </w:style>
   <w:style w:type="character" w:customStyle="1" w:styleId="TitleChar">

</xml_diff>

<commit_message>
feat(scribble): docx body-align — structured Affected Assets (host:port/tcp) + Reproduction code box, shared with HTML
</commit_message>
<xml_diff>
--- a/scribble/scribble/report_templates/default.docx
+++ b/scribble/scribble/report_templates/default.docx
@@ -998,6 +998,115 @@
           </w:p>
           <w:p>
             <w:r>
+              <w:t>{% if f.repro %}</w:t>
+            </w:r>
+          </w:p>
+          <w:p>
+            <w:r>
+              <w:rPr>
+                <w:rFonts w:ascii="Liberation Sans" w:hAnsi="Liberation Sans"/>
+                <w:b/>
+                <w:i w:val="0"/>
+                <w:color w:val="0A5B3D"/>
+                <w:sz w:val="18"/>
+                <w:caps w:val="true"/>
+                <w:spacing w:val="8"/>
+              </w:rPr>
+              <w:t>Reproduction</w:t>
+            </w:r>
+          </w:p>
+          <w:p>
+            <w:r>
+              <w:t>{% for r in f.repro %}</w:t>
+            </w:r>
+          </w:p>
+          <w:p>
+            <w:pPr>
+              <w:shd w:val="clear" w:color="auto" w:fill="EFF3F6"/>
+              <w:spacing w:before="20" w:after="20"/>
+            </w:pPr>
+            <w:r>
+              <w:rPr>
+                <w:rFonts w:ascii="DejaVu Sans Mono" w:hAnsi="DejaVu Sans Mono"/>
+                <w:b w:val="0"/>
+                <w:i w:val="0"/>
+                <w:color w:val="3D4B59"/>
+                <w:sz w:val="17"/>
+              </w:rPr>
+              <w:t>{{ r }}</w:t>
+            </w:r>
+          </w:p>
+          <w:p>
+            <w:r>
+              <w:t>{% endfor %}</w:t>
+            </w:r>
+          </w:p>
+          <w:p>
+            <w:r>
+              <w:t>{% endif %}</w:t>
+            </w:r>
+          </w:p>
+          <w:p>
+            <w:r>
+              <w:t>{% if f.assets %}</w:t>
+            </w:r>
+          </w:p>
+          <w:p>
+            <w:r>
+              <w:rPr>
+                <w:rFonts w:ascii="Liberation Sans" w:hAnsi="Liberation Sans"/>
+                <w:b/>
+                <w:i w:val="0"/>
+                <w:color w:val="0A5B3D"/>
+                <w:sz w:val="18"/>
+                <w:caps w:val="true"/>
+                <w:spacing w:val="8"/>
+              </w:rPr>
+              <w:t>Affected Assets ({{ f.assets|length }})</w:t>
+            </w:r>
+          </w:p>
+          <w:p>
+            <w:r>
+              <w:t>{% for a in f.assets %}</w:t>
+            </w:r>
+          </w:p>
+          <w:p>
+            <w:pPr>
+              <w:spacing w:before="0" w:after="0"/>
+            </w:pPr>
+            <w:r>
+              <w:rPr>
+                <w:rFonts w:ascii="Liberation Sans" w:hAnsi="Liberation Sans"/>
+                <w:b w:val="0"/>
+                <w:i w:val="0"/>
+                <w:color w:val="6B7A89"/>
+                <w:sz w:val="18"/>
+              </w:rPr>
+              <w:t xml:space="preserve">•  </w:t>
+            </w:r>
+            <w:r>
+              <w:rPr>
+                <w:rFonts w:ascii="DejaVu Sans Mono" w:hAnsi="DejaVu Sans Mono"/>
+                <w:b w:val="0"/>
+                <w:i w:val="0"/>
+                <w:color w:val="131B24"/>
+                <w:sz w:val="18"/>
+              </w:rPr>
+              <w:t>{{ a }}</w:t>
+            </w:r>
+          </w:p>
+          <w:p>
+            <w:r>
+              <w:t>{% endfor %}</w:t>
+            </w:r>
+          </w:p>
+          <w:p>
+            <w:r>
+              <w:t>{% endif %}</w:t>
+            </w:r>
+          </w:p>
+          <w:p>
+            <w:r>
               <w:t>{% if f.artifacts %}</w:t>
             </w:r>
           </w:p>

</xml_diff>

<commit_message>
feat(scribble): rounded padded Reproduction code box + centered screenshots
- Reproduction is now a ROUNDED, padded monospace code box (a roundRect shape whose txbxContent runs the
  Jinja {%p for r in f.repro %} loop, auto-growing to the line count) — real internal padding + rounded
  corners, matching the pills, instead of flat shaded lines. Verified: docxtpl processes the loop inside
  the shape and LibreOffice renders it rounded.
- Evidence screenshots are centered in the card, with the caption centered under them.

_code_box() helper added. (The Details/content code block still renders via the shared content renderer's
square shaded style — rounding that path is a follow-up for full consistency.)

Co-Authored-By: Claude Opus 4.8 <noreply@anthropic.com>
</commit_message>
<xml_diff>
--- a/scribble/scribble/report_templates/default.docx
+++ b/scribble/scribble/report_templates/default.docx
@@ -1401,28 +1401,73 @@
           </w:p>
           <w:p>
             <w:r>
-              <w:t>{%p for r in f.repro %}</w:t>
-            </w:r>
-          </w:p>
-          <w:p>
-            <w:pPr>
-              <w:shd w:val="clear" w:color="auto" w:fill="EFF3F6"/>
-              <w:spacing w:before="20" w:after="20"/>
-            </w:pPr>
-            <w:r>
-              <w:rPr>
-                <w:rFonts w:ascii="JetBrains Mono" w:hAnsi="JetBrains Mono"/>
-                <w:b w:val="0"/>
-                <w:i w:val="0"/>
-                <w:color w:val="3D4B59"/>
-                <w:sz w:val="17"/>
-              </w:rPr>
-              <w:t>{{ r }}</w:t>
-            </w:r>
-          </w:p>
-          <w:p>
-            <w:r>
-              <w:t>{%p endfor %}</w:t>
+              <w:drawing>
+                <wp:inline distT="0" distB="0" distL="0" distR="0">
+                  <wp:extent cx="6263640" cy="274320"/>
+                  <wp:effectExtent l="0" t="0" r="0" b="0"/>
+                  <wp:docPr id="1009" name="codebox1009"/>
+                  <a:graphic xmlns:a="http://schemas.openxmlformats.org/drawingml/2006/main">
+                    <a:graphicData uri="http://schemas.microsoft.com/office/word/2010/wordprocessingShape">
+                      <wps:wsp>
+                        <wps:cNvSpPr txBox="1"/>
+                        <wps:spPr>
+                          <a:xfrm>
+                            <a:off x="0" y="0"/>
+                            <a:ext cx="6263640" cy="274320"/>
+                          </a:xfrm>
+                          <a:prstGeom prst="roundRect">
+                            <a:avLst>
+                              <a:gd name="adj" fmla="val 8000"/>
+                            </a:avLst>
+                          </a:prstGeom>
+                          <a:solidFill>
+                            <a:srgbClr val="EFF3F6"/>
+                          </a:solidFill>
+                          <a:ln>
+                            <a:noFill/>
+                          </a:ln>
+                        </wps:spPr>
+                        <wps:txbx>
+                          <w:txbxContent>
+                            <w:p>
+                              <w:pPr>
+                                <w:spacing w:before="0" w:after="0"/>
+                              </w:pPr>
+                              <w:r>
+                                <w:t xml:space="preserve">{%p for r in f.repro %}</w:t>
+                              </w:r>
+                            </w:p>
+                            <w:p>
+                              <w:pPr>
+                                <w:spacing w:before="0" w:after="0" w:line="240" w:lineRule="auto"/>
+                              </w:pPr>
+                              <w:r>
+                                <w:rPr>
+                                  <w:rFonts w:ascii="JetBrains Mono" w:hAnsi="JetBrains Mono"/>
+                                  <w:color w:val="3D4B59"/>
+                                  <w:sz w:val="17"/>
+                                </w:rPr>
+                                <w:t xml:space="preserve">{{ r }}</w:t>
+                              </w:r>
+                            </w:p>
+                            <w:p>
+                              <w:pPr>
+                                <w:spacing w:before="0" w:after="0"/>
+                              </w:pPr>
+                              <w:r>
+                                <w:t xml:space="preserve">{%p endfor %}</w:t>
+                              </w:r>
+                            </w:p>
+                          </w:txbxContent>
+                        </wps:txbx>
+                        <wps:bodyPr rot="0" anchor="t" lIns="91440" tIns="54864" rIns="91440" bIns="54864">
+                          <a:spAutoFit/>
+                        </wps:bodyPr>
+                      </wps:wsp>
+                    </a:graphicData>
+                  </a:graphic>
+                </wp:inline>
+              </w:drawing>
             </w:r>
           </w:p>
           <w:p>
@@ -1511,11 +1556,18 @@
             </w:r>
           </w:p>
           <w:p>
+            <w:pPr>
+              <w:spacing w:before="80" w:after="20"/>
+              <w:jc w:val="center"/>
+            </w:pPr>
             <w:r>
               <w:t>{{ a.image }}</w:t>
             </w:r>
           </w:p>
           <w:p>
+            <w:pPr>
+              <w:jc w:val="center"/>
+            </w:pPr>
             <w:r>
               <w:rPr>
                 <w:rFonts w:ascii="Inter" w:hAnsi="Inter"/>

</xml_diff>

<commit_message>
feat(scribble): professional style pass on the report DOCX cover + chrome
Converge the DOCX deliverable on render_html's already-professional design (the
HTML was the spec; the DOCX had drifted into a template-generated look).

Cover: replace the full-bleed green band + centered red CONFIDENTIAL with a large
ink title under a thin accent keyline, a small accent-ink client eyebrow, and a
keylined CONFIDENTIAL classification footer. Dedupe Client/Company to one row and
guard the testing-window row so an unset range no longer prints a dangling en-dash.

Chrome: demote the brand green from section headings (H1 -> ink-2 UPPERCASE +
tracked, under an accent keyline, matching .sec-h) and from block labels (the
DESCRIPTION/REMEDIATION/etc. green pills become accent-ink small-caps TEXT, like
.block-label); keep the filled pill only for the severity/CVSS/affected badge row.
Open the type scale and loosen body leading. Regenerate default.docx.
</commit_message>
<xml_diff>
--- a/scribble/scribble/report_templates/default.docx
+++ b/scribble/scribble/report_templates/default.docx
@@ -11,91 +11,70 @@
     </w:p>
     <w:p>
       <w:pPr>
-        <w:spacing w:before="0" w:after="160"/>
-        <w:jc w:val="center"/>
+        <w:spacing w:before="0" w:after="0"/>
+      </w:pPr>
+    </w:p>
+    <w:p>
+      <w:pPr>
+        <w:spacing w:before="0" w:after="0"/>
+      </w:pPr>
+    </w:p>
+    <w:p>
+      <w:pPr>
+        <w:spacing w:before="0" w:after="240"/>
       </w:pPr>
       <w:r>
         <w:t>{{ cover_logo }}</w:t>
       </w:r>
     </w:p>
-    <w:tbl>
-      <w:tblPr>
-        <w:tblW w:type="auto" w:w="0"/>
-        <w:jc w:val="center"/>
-        <w:tblLook w:firstColumn="1" w:firstRow="1" w:lastColumn="0" w:lastRow="0" w:noHBand="0" w:noVBand="1" w:val="04A0"/>
-      </w:tblPr>
-      <w:tblGrid>
-        <w:gridCol w:w="10512"/>
-      </w:tblGrid>
-      <w:tr>
-        <w:tc>
-          <w:tcPr>
-            <w:tcW w:type="dxa" w:w="10512"/>
-            <w:shd w:val="clear" w:color="auto" w:fill="0F7A52"/>
-            <w:tcMar>
-              <w:top w:w="180" w:type="dxa"/>
-              <w:bottom w:w="180" w:type="dxa"/>
-              <w:left w:w="160" w:type="dxa"/>
-              <w:right w:w="160" w:type="dxa"/>
-            </w:tcMar>
-            <w:tcBorders>
-              <w:top w:val="nil"/>
-              <w:left w:val="nil"/>
-              <w:bottom w:val="nil"/>
-              <w:right w:val="nil"/>
-            </w:tcBorders>
-          </w:tcPr>
-          <w:p>
-            <w:r>
-              <w:rPr>
-                <w:rFonts w:ascii="Inter" w:hAnsi="Inter"/>
-                <w:b/>
-                <w:i w:val="0"/>
-                <w:color w:val="FFFFFF"/>
-                <w:sz w:val="48"/>
-              </w:rPr>
-              <w:t>{{ engagement_name }}</w:t>
-            </w:r>
-          </w:p>
-          <w:p>
-            <w:r>
-              <w:rPr>
-                <w:rFonts w:ascii="Inter" w:hAnsi="Inter"/>
-                <w:b w:val="0"/>
-                <w:i w:val="0"/>
-                <w:color w:val="D6EFE3"/>
-                <w:sz w:val="24"/>
-              </w:rPr>
-              <w:t>Security Assessment Report</w:t>
-            </w:r>
-          </w:p>
-        </w:tc>
-      </w:tr>
-    </w:tbl>
-    <w:p/>
     <w:p>
       <w:pPr>
-        <w:spacing w:before="20" w:after="20"/>
+        <w:spacing w:before="0" w:after="40"/>
       </w:pPr>
       <w:r>
         <w:rPr>
           <w:rFonts w:ascii="Inter" w:hAnsi="Inter"/>
           <w:b/>
           <w:i w:val="0"/>
-          <w:color w:val="6B7A89"/>
+          <w:color w:val="0A5B3D"/>
           <w:sz w:val="20"/>
+          <w:caps w:val="true"/>
+          <w:spacing w:val="8"/>
         </w:rPr>
-        <w:t xml:space="preserve">Client   </w:t>
+        <w:t>{{ client_name or company_name }}</w:t>
       </w:r>
+    </w:p>
+    <w:p>
+      <w:pPr>
+        <w:spacing w:before="0" w:after="140"/>
+        <w:pBdr>
+          <w:bottom w:val="single" w:sz="18" w:space="6" w:color="0F7A52"/>
+        </w:pBdr>
+      </w:pPr>
+      <w:r>
+        <w:rPr>
+          <w:rFonts w:ascii="Inter" w:hAnsi="Inter"/>
+          <w:b/>
+          <w:i w:val="0"/>
+          <w:color w:val="131B24"/>
+          <w:sz w:val="56"/>
+        </w:rPr>
+        <w:t>{{ engagement_name }}</w:t>
+      </w:r>
+    </w:p>
+    <w:p>
+      <w:pPr>
+        <w:spacing w:before="80" w:after="360"/>
+      </w:pPr>
       <w:r>
         <w:rPr>
           <w:rFonts w:ascii="Inter" w:hAnsi="Inter"/>
           <w:b w:val="0"/>
           <w:i w:val="0"/>
-          <w:color w:val="131B24"/>
-          <w:sz w:val="20"/>
+          <w:color w:val="3D4B59"/>
+          <w:sz w:val="26"/>
         </w:rPr>
-        <w:t>{{ client_name }}</w:t>
+        <w:t>Security Assessment Report</w:t>
       </w:r>
     </w:p>
     <w:p>
@@ -108,19 +87,21 @@
           <w:b/>
           <w:i w:val="0"/>
           <w:color w:val="6B7A89"/>
-          <w:sz w:val="20"/>
+          <w:sz w:val="18"/>
+          <w:caps w:val="true"/>
+          <w:spacing w:val="8"/>
         </w:rPr>
-        <w:t xml:space="preserve">Company   </w:t>
+        <w:t xml:space="preserve">Client   </w:t>
       </w:r>
       <w:r>
         <w:rPr>
           <w:rFonts w:ascii="Inter" w:hAnsi="Inter"/>
-          <w:b w:val="0"/>
+          <w:b/>
           <w:i w:val="0"/>
           <w:color w:val="131B24"/>
-          <w:sz w:val="20"/>
+          <w:sz w:val="22"/>
         </w:rPr>
-        <w:t>{{ company_name }}</w:t>
+        <w:t>{{ client_name or company_name }}</w:t>
       </w:r>
     </w:p>
     <w:p>
@@ -133,19 +114,26 @@
           <w:b/>
           <w:i w:val="0"/>
           <w:color w:val="6B7A89"/>
-          <w:sz w:val="20"/>
+          <w:sz w:val="18"/>
+          <w:caps w:val="true"/>
+          <w:spacing w:val="8"/>
         </w:rPr>
-        <w:t xml:space="preserve">Scope   </w:t>
+        <w:t xml:space="preserve">Assessment type   </w:t>
       </w:r>
       <w:r>
         <w:rPr>
           <w:rFonts w:ascii="Inter" w:hAnsi="Inter"/>
-          <w:b w:val="0"/>
+          <w:b/>
           <w:i w:val="0"/>
           <w:color w:val="131B24"/>
-          <w:sz w:val="20"/>
+          <w:sz w:val="22"/>
         </w:rPr>
         <w:t>{{ scope_type }}</w:t>
+      </w:r>
+    </w:p>
+    <w:p>
+      <w:r>
+        <w:t>{%p if start_date and end_date %}</w:t>
       </w:r>
     </w:p>
     <w:p>
@@ -158,19 +146,26 @@
           <w:b/>
           <w:i w:val="0"/>
           <w:color w:val="6B7A89"/>
-          <w:sz w:val="20"/>
+          <w:sz w:val="18"/>
+          <w:caps w:val="true"/>
+          <w:spacing w:val="8"/>
         </w:rPr>
-        <w:t xml:space="preserve">Assessment window   </w:t>
+        <w:t xml:space="preserve">Testing window   </w:t>
       </w:r>
       <w:r>
         <w:rPr>
           <w:rFonts w:ascii="Inter" w:hAnsi="Inter"/>
-          <w:b w:val="0"/>
+          <w:b/>
           <w:i w:val="0"/>
           <w:color w:val="131B24"/>
-          <w:sz w:val="20"/>
+          <w:sz w:val="22"/>
         </w:rPr>
         <w:t>{{ start_date }} – {{ end_date }}</w:t>
+      </w:r>
+    </w:p>
+    <w:p>
+      <w:r>
+        <w:t>{%p endif %}</w:t>
       </w:r>
     </w:p>
     <w:p>
@@ -183,25 +178,29 @@
           <w:b/>
           <w:i w:val="0"/>
           <w:color w:val="6B7A89"/>
-          <w:sz w:val="20"/>
+          <w:sz w:val="18"/>
+          <w:caps w:val="true"/>
+          <w:spacing w:val="8"/>
         </w:rPr>
-        <w:t xml:space="preserve">Report generated   </w:t>
+        <w:t xml:space="preserve">Report date   </w:t>
       </w:r>
       <w:r>
         <w:rPr>
           <w:rFonts w:ascii="Inter" w:hAnsi="Inter"/>
-          <w:b w:val="0"/>
+          <w:b/>
           <w:i w:val="0"/>
           <w:color w:val="131B24"/>
-          <w:sz w:val="20"/>
+          <w:sz w:val="22"/>
         </w:rPr>
         <w:t>{{ generated_date }}</w:t>
       </w:r>
     </w:p>
-    <w:p/>
     <w:p>
       <w:pPr>
-        <w:jc w:val="center"/>
+        <w:spacing w:before="1920" w:after="0"/>
+        <w:pBdr>
+          <w:top w:val="single" w:sz="16" w:space="8" w:color="B3261E"/>
+        </w:pBdr>
       </w:pPr>
       <w:r>
         <w:rPr>
@@ -209,7 +208,7 @@
           <w:b/>
           <w:i w:val="0"/>
           <w:color w:val="B3261E"/>
-          <w:sz w:val="22"/>
+          <w:sz w:val="20"/>
           <w:caps w:val="true"/>
           <w:spacing w:val="8"/>
         </w:rPr>
@@ -231,7 +230,7 @@
     <w:p>
       <w:pPr>
         <w:pStyle w:val="Heading1"/>
-        <w:spacing w:before="40" w:after="120"/>
+        <w:spacing w:before="240" w:after="120"/>
         <w:pBdr>
           <w:bottom w:val="single" w:sz="8" w:space="2" w:color="0F7A52"/>
         </w:pBdr>
@@ -264,7 +263,7 @@
     <w:p>
       <w:pPr>
         <w:pStyle w:val="Heading1"/>
-        <w:spacing w:before="40" w:after="120"/>
+        <w:spacing w:before="240" w:after="120"/>
         <w:pBdr>
           <w:bottom w:val="single" w:sz="8" w:space="2" w:color="0F7A52"/>
         </w:pBdr>
@@ -420,59 +419,15 @@
         <w:spacing w:before="120" w:after="60"/>
       </w:pPr>
       <w:r>
-        <w:drawing>
-          <wp:inline distT="0" distB="0" distL="0" distR="0">
-            <wp:extent cx="1851660" cy="219456"/>
-            <wp:effectExtent l="0" t="0" r="0" b="0"/>
-            <wp:docPr id="1001" name="label1001"/>
-            <a:graphic xmlns:a="http://schemas.openxmlformats.org/drawingml/2006/main">
-              <a:graphicData uri="http://schemas.microsoft.com/office/word/2010/wordprocessingShape">
-                <wps:wsp>
-                  <wps:cNvSpPr txBox="0"/>
-                  <wps:spPr>
-                    <a:xfrm>
-                      <a:off x="0" y="0"/>
-                      <a:ext cx="1851660" cy="219456"/>
-                    </a:xfrm>
-                    <a:prstGeom prst="roundRect">
-                      <a:avLst>
-                        <a:gd name="adj" fmla="val 50000"/>
-                      </a:avLst>
-                    </a:prstGeom>
-                    <a:solidFill>
-                      <a:srgbClr val="E7F3ED"/>
-                    </a:solidFill>
-                    <a:ln>
-                      <a:noFill/>
-                    </a:ln>
-                  </wps:spPr>
-                  <wps:txbx>
-                    <w:txbxContent>
-                      <w:p>
-                        <w:pPr>
-                          <w:jc w:val="left"/>
-                          <w:spacing w:before="0" w:after="0" w:line="240" w:lineRule="auto"/>
-                        </w:pPr>
-                        <w:r>
-                          <w:rPr>
-                            <w:b/>
-                            <w:caps w:val="true"/>
-                            <w:spacing w:val="8"/>
-                            <w:color w:val="0A5B3D"/>
-                            <w:sz w:val="15"/>
-                            <w:rFonts w:ascii="Inter" w:hAnsi="Inter"/>
-                          </w:rPr>
-                          <w:t xml:space="preserve">Scope and Limitations</w:t>
-                        </w:r>
-                      </w:p>
-                    </w:txbxContent>
-                  </wps:txbx>
-                  <wps:bodyPr rot="0" anchor="ctr" anchorCtr="0" lIns="64008" tIns="0" rIns="45720" bIns="0"/>
-                </wps:wsp>
-              </a:graphicData>
-            </a:graphic>
-          </wp:inline>
-        </w:drawing>
+        <w:rPr>
+          <w:b/>
+          <w:caps w:val="true"/>
+          <w:spacing w:val="10"/>
+          <w:color w:val="0A5B3D"/>
+          <w:sz w:val="17"/>
+          <w:rFonts w:ascii="Inter" w:hAnsi="Inter"/>
+        </w:rPr>
+        <w:t xml:space="preserve">Scope and Limitations</w:t>
       </w:r>
     </w:p>
     <w:p>
@@ -849,7 +804,7 @@
     <w:p>
       <w:pPr>
         <w:pStyle w:val="Heading1"/>
-        <w:spacing w:before="40" w:after="120"/>
+        <w:spacing w:before="240" w:after="120"/>
         <w:pBdr>
           <w:bottom w:val="single" w:sz="8" w:space="2" w:color="0F7A52"/>
         </w:pBdr>
@@ -985,7 +940,7 @@
                 <wp:inline distT="0" distB="0" distL="0" distR="0">
                   <wp:extent cx="868680" cy="219456"/>
                   <wp:effectExtent l="0" t="0" r="0" b="0"/>
-                  <wp:docPr id="1002" name="pill1002"/>
+                  <wp:docPr id="1001" name="pill1001"/>
                   <a:graphic xmlns:a="http://schemas.openxmlformats.org/drawingml/2006/main">
                     <a:graphicData uri="http://schemas.microsoft.com/office/word/2010/wordprocessingShape">
                       <wps:wsp>
@@ -1019,7 +974,7 @@
                                   <w:b/>
                                   <w:caps w:val="true"/>
                                   <w:color w:val="FFFFFF"/>
-                                  <w:sz w:val="15"/>
+                                  <w:sz w:val="17"/>
                                   <w:rFonts w:ascii="Inter" w:hAnsi="Inter"/>
                                 </w:rPr>
                                 <w:t xml:space="preserve">{{ f.severity_label }}</w:t>
@@ -1042,7 +997,7 @@
                 <wp:inline distT="0" distB="0" distL="0" distR="0">
                   <wp:extent cx="868680" cy="219456"/>
                   <wp:effectExtent l="0" t="0" r="0" b="0"/>
-                  <wp:docPr id="1003" name="pill1003"/>
+                  <wp:docPr id="1002" name="pill1002"/>
                   <a:graphic xmlns:a="http://schemas.openxmlformats.org/drawingml/2006/main">
                     <a:graphicData uri="http://schemas.microsoft.com/office/word/2010/wordprocessingShape">
                       <wps:wsp>
@@ -1076,7 +1031,7 @@
                                   <w:b/>
                                   <w:caps w:val="true"/>
                                   <w:color w:val="FFFFFF"/>
-                                  <w:sz w:val="15"/>
+                                  <w:sz w:val="17"/>
                                   <w:rFonts w:ascii="Inter" w:hAnsi="Inter"/>
                                 </w:rPr>
                                 <w:t xml:space="preserve">{{ f.severity_label }}</w:t>
@@ -1099,7 +1054,7 @@
                 <wp:inline distT="0" distB="0" distL="0" distR="0">
                   <wp:extent cx="868680" cy="219456"/>
                   <wp:effectExtent l="0" t="0" r="0" b="0"/>
-                  <wp:docPr id="1004" name="pill1004"/>
+                  <wp:docPr id="1003" name="pill1003"/>
                   <a:graphic xmlns:a="http://schemas.openxmlformats.org/drawingml/2006/main">
                     <a:graphicData uri="http://schemas.microsoft.com/office/word/2010/wordprocessingShape">
                       <wps:wsp>
@@ -1133,7 +1088,7 @@
                                   <w:b/>
                                   <w:caps w:val="true"/>
                                   <w:color w:val="FFFFFF"/>
-                                  <w:sz w:val="15"/>
+                                  <w:sz w:val="17"/>
                                   <w:rFonts w:ascii="Inter" w:hAnsi="Inter"/>
                                 </w:rPr>
                                 <w:t xml:space="preserve">{{ f.severity_label }}</w:t>
@@ -1156,7 +1111,7 @@
                 <wp:inline distT="0" distB="0" distL="0" distR="0">
                   <wp:extent cx="868680" cy="219456"/>
                   <wp:effectExtent l="0" t="0" r="0" b="0"/>
-                  <wp:docPr id="1005" name="pill1005"/>
+                  <wp:docPr id="1004" name="pill1004"/>
                   <a:graphic xmlns:a="http://schemas.openxmlformats.org/drawingml/2006/main">
                     <a:graphicData uri="http://schemas.microsoft.com/office/word/2010/wordprocessingShape">
                       <wps:wsp>
@@ -1190,7 +1145,7 @@
                                   <w:b/>
                                   <w:caps w:val="true"/>
                                   <w:color w:val="FFFFFF"/>
-                                  <w:sz w:val="15"/>
+                                  <w:sz w:val="17"/>
                                   <w:rFonts w:ascii="Inter" w:hAnsi="Inter"/>
                                 </w:rPr>
                                 <w:t xml:space="preserve">{{ f.severity_label }}</w:t>
@@ -1213,7 +1168,7 @@
                 <wp:inline distT="0" distB="0" distL="0" distR="0">
                   <wp:extent cx="868680" cy="219456"/>
                   <wp:effectExtent l="0" t="0" r="0" b="0"/>
-                  <wp:docPr id="1006" name="pill1006"/>
+                  <wp:docPr id="1005" name="pill1005"/>
                   <a:graphic xmlns:a="http://schemas.openxmlformats.org/drawingml/2006/main">
                     <a:graphicData uri="http://schemas.microsoft.com/office/word/2010/wordprocessingShape">
                       <wps:wsp>
@@ -1247,7 +1202,7 @@
                                   <w:b/>
                                   <w:caps w:val="true"/>
                                   <w:color w:val="FFFFFF"/>
-                                  <w:sz w:val="15"/>
+                                  <w:sz w:val="17"/>
                                   <w:rFonts w:ascii="Inter" w:hAnsi="Inter"/>
                                 </w:rPr>
                                 <w:t xml:space="preserve">{{ f.severity_label }}</w:t>
@@ -1270,7 +1225,7 @@
                 <wp:inline distT="0" distB="0" distL="0" distR="0">
                   <wp:extent cx="868680" cy="219456"/>
                   <wp:effectExtent l="0" t="0" r="0" b="0"/>
-                  <wp:docPr id="1007" name="pill1007"/>
+                  <wp:docPr id="1006" name="pill1006"/>
                   <a:graphic xmlns:a="http://schemas.openxmlformats.org/drawingml/2006/main">
                     <a:graphicData uri="http://schemas.microsoft.com/office/word/2010/wordprocessingShape">
                       <wps:wsp>
@@ -1304,7 +1259,7 @@
                                   <w:b/>
                                   <w:caps w:val="true"/>
                                   <w:color w:val="FFFFFF"/>
-                                  <w:sz w:val="15"/>
+                                  <w:sz w:val="17"/>
                                   <w:rFonts w:ascii="Inter" w:hAnsi="Inter"/>
                                 </w:rPr>
                                 <w:t xml:space="preserve">{{ f.severity_label }}</w:t>
@@ -1340,7 +1295,7 @@
                 <wp:inline distT="0" distB="0" distL="0" distR="0">
                   <wp:extent cx="822960" cy="219456"/>
                   <wp:effectExtent l="0" t="0" r="0" b="0"/>
-                  <wp:docPr id="1008" name="pill1008"/>
+                  <wp:docPr id="1007" name="pill1007"/>
                   <a:graphic xmlns:a="http://schemas.openxmlformats.org/drawingml/2006/main">
                     <a:graphicData uri="http://schemas.microsoft.com/office/word/2010/wordprocessingShape">
                       <wps:wsp>
@@ -1373,7 +1328,7 @@
                                 <w:rPr>
                                   <w:b/>
                                   <w:color w:val="3D4B59"/>
-                                  <w:sz w:val="15"/>
+                                  <w:sz w:val="17"/>
                                   <w:rFonts w:ascii="Inter" w:hAnsi="Inter"/>
                                 </w:rPr>
                                 <w:t xml:space="preserve">CVSS {{ f.cvss_score }}</w:t>
@@ -1409,7 +1364,7 @@
                 <wp:inline distT="0" distB="0" distL="0" distR="0">
                   <wp:extent cx="1554480" cy="219456"/>
                   <wp:effectExtent l="0" t="0" r="0" b="0"/>
-                  <wp:docPr id="1009" name="pill1009"/>
+                  <wp:docPr id="1008" name="pill1008"/>
                   <a:graphic xmlns:a="http://schemas.openxmlformats.org/drawingml/2006/main">
                     <a:graphicData uri="http://schemas.microsoft.com/office/word/2010/wordprocessingShape">
                       <wps:wsp>
@@ -1442,7 +1397,7 @@
                                 <w:rPr>
                                   <w:b/>
                                   <w:color w:val="6B7A89"/>
-                                  <w:sz w:val="15"/>
+                                  <w:sz w:val="17"/>
                                   <w:rFonts w:ascii="Inter" w:hAnsi="Inter"/>
                                 </w:rPr>
                                 <w:t xml:space="preserve">{{ f.assets|length }} affected asset{{ 's' if f.assets|length != 1 else '' }}</w:t>
@@ -1508,59 +1463,15 @@
               <w:spacing w:before="120" w:after="60"/>
             </w:pPr>
             <w:r>
-              <w:drawing>
-                <wp:inline distT="0" distB="0" distL="0" distR="0">
-                  <wp:extent cx="1152144" cy="219456"/>
-                  <wp:effectExtent l="0" t="0" r="0" b="0"/>
-                  <wp:docPr id="1010" name="label1010"/>
-                  <a:graphic xmlns:a="http://schemas.openxmlformats.org/drawingml/2006/main">
-                    <a:graphicData uri="http://schemas.microsoft.com/office/word/2010/wordprocessingShape">
-                      <wps:wsp>
-                        <wps:cNvSpPr txBox="0"/>
-                        <wps:spPr>
-                          <a:xfrm>
-                            <a:off x="0" y="0"/>
-                            <a:ext cx="1152144" cy="219456"/>
-                          </a:xfrm>
-                          <a:prstGeom prst="roundRect">
-                            <a:avLst>
-                              <a:gd name="adj" fmla="val 50000"/>
-                            </a:avLst>
-                          </a:prstGeom>
-                          <a:solidFill>
-                            <a:srgbClr val="E7F3ED"/>
-                          </a:solidFill>
-                          <a:ln>
-                            <a:noFill/>
-                          </a:ln>
-                        </wps:spPr>
-                        <wps:txbx>
-                          <w:txbxContent>
-                            <w:p>
-                              <w:pPr>
-                                <w:jc w:val="left"/>
-                                <w:spacing w:before="0" w:after="0" w:line="240" w:lineRule="auto"/>
-                              </w:pPr>
-                              <w:r>
-                                <w:rPr>
-                                  <w:b/>
-                                  <w:caps w:val="true"/>
-                                  <w:spacing w:val="8"/>
-                                  <w:color w:val="0A5B3D"/>
-                                  <w:sz w:val="15"/>
-                                  <w:rFonts w:ascii="Inter" w:hAnsi="Inter"/>
-                                </w:rPr>
-                                <w:t xml:space="preserve">Reproduction</w:t>
-                              </w:r>
-                            </w:p>
-                          </w:txbxContent>
-                        </wps:txbx>
-                        <wps:bodyPr rot="0" anchor="ctr" anchorCtr="0" lIns="64008" tIns="0" rIns="45720" bIns="0"/>
-                      </wps:wsp>
-                    </a:graphicData>
-                  </a:graphic>
-                </wp:inline>
-              </w:drawing>
+              <w:rPr>
+                <w:b/>
+                <w:caps w:val="true"/>
+                <w:spacing w:val="10"/>
+                <w:color w:val="0A5B3D"/>
+                <w:sz w:val="17"/>
+                <w:rFonts w:ascii="Inter" w:hAnsi="Inter"/>
+              </w:rPr>
+              <w:t xml:space="preserve">Reproduction</w:t>
             </w:r>
           </w:p>
           <w:p>
@@ -1569,7 +1480,7 @@
                 <wp:inline distT="0" distB="0" distL="0" distR="0">
                   <wp:extent cx="6263640" cy="274320"/>
                   <wp:effectExtent l="0" t="0" r="0" b="0"/>
-                  <wp:docPr id="1011" name="codebox1011"/>
+                  <wp:docPr id="1009" name="codebox1009"/>
                   <a:graphic xmlns:a="http://schemas.openxmlformats.org/drawingml/2006/main">
                     <a:graphicData uri="http://schemas.microsoft.com/office/word/2010/wordprocessingShape">
                       <wps:wsp>
@@ -1649,59 +1560,15 @@
               <w:spacing w:before="120" w:after="60"/>
             </w:pPr>
             <w:r>
-              <w:drawing>
-                <wp:inline distT="0" distB="0" distL="0" distR="0">
-                  <wp:extent cx="1773936" cy="219456"/>
-                  <wp:effectExtent l="0" t="0" r="0" b="0"/>
-                  <wp:docPr id="1012" name="label1012"/>
-                  <a:graphic xmlns:a="http://schemas.openxmlformats.org/drawingml/2006/main">
-                    <a:graphicData uri="http://schemas.microsoft.com/office/word/2010/wordprocessingShape">
-                      <wps:wsp>
-                        <wps:cNvSpPr txBox="0"/>
-                        <wps:spPr>
-                          <a:xfrm>
-                            <a:off x="0" y="0"/>
-                            <a:ext cx="1773936" cy="219456"/>
-                          </a:xfrm>
-                          <a:prstGeom prst="roundRect">
-                            <a:avLst>
-                              <a:gd name="adj" fmla="val 50000"/>
-                            </a:avLst>
-                          </a:prstGeom>
-                          <a:solidFill>
-                            <a:srgbClr val="E7F3ED"/>
-                          </a:solidFill>
-                          <a:ln>
-                            <a:noFill/>
-                          </a:ln>
-                        </wps:spPr>
-                        <wps:txbx>
-                          <w:txbxContent>
-                            <w:p>
-                              <w:pPr>
-                                <w:jc w:val="left"/>
-                                <w:spacing w:before="0" w:after="0" w:line="240" w:lineRule="auto"/>
-                              </w:pPr>
-                              <w:r>
-                                <w:rPr>
-                                  <w:b/>
-                                  <w:caps w:val="true"/>
-                                  <w:spacing w:val="8"/>
-                                  <w:color w:val="0A5B3D"/>
-                                  <w:sz w:val="15"/>
-                                  <w:rFonts w:ascii="Inter" w:hAnsi="Inter"/>
-                                </w:rPr>
-                                <w:t xml:space="preserve">Affected Assets ({{ f.assets|length }})</w:t>
-                              </w:r>
-                            </w:p>
-                          </w:txbxContent>
-                        </wps:txbx>
-                        <wps:bodyPr rot="0" anchor="ctr" anchorCtr="0" lIns="64008" tIns="0" rIns="45720" bIns="0"/>
-                      </wps:wsp>
-                    </a:graphicData>
-                  </a:graphic>
-                </wp:inline>
-              </w:drawing>
+              <w:rPr>
+                <w:b/>
+                <w:caps w:val="true"/>
+                <w:spacing w:val="10"/>
+                <w:color w:val="0A5B3D"/>
+                <w:sz w:val="17"/>
+                <w:rFonts w:ascii="Inter" w:hAnsi="Inter"/>
+              </w:rPr>
+              <w:t xml:space="preserve">Affected Assets ({{ f.assets|length }})</w:t>
             </w:r>
           </w:p>
           <w:p>
@@ -1744,59 +1611,15 @@
               <w:spacing w:before="120" w:after="60"/>
             </w:pPr>
             <w:r>
-              <w:drawing>
-                <wp:inline distT="0" distB="0" distL="0" distR="0">
-                  <wp:extent cx="868680" cy="219456"/>
-                  <wp:effectExtent l="0" t="0" r="0" b="0"/>
-                  <wp:docPr id="1013" name="label1013"/>
-                  <a:graphic xmlns:a="http://schemas.openxmlformats.org/drawingml/2006/main">
-                    <a:graphicData uri="http://schemas.microsoft.com/office/word/2010/wordprocessingShape">
-                      <wps:wsp>
-                        <wps:cNvSpPr txBox="0"/>
-                        <wps:spPr>
-                          <a:xfrm>
-                            <a:off x="0" y="0"/>
-                            <a:ext cx="868680" cy="219456"/>
-                          </a:xfrm>
-                          <a:prstGeom prst="roundRect">
-                            <a:avLst>
-                              <a:gd name="adj" fmla="val 50000"/>
-                            </a:avLst>
-                          </a:prstGeom>
-                          <a:solidFill>
-                            <a:srgbClr val="E7F3ED"/>
-                          </a:solidFill>
-                          <a:ln>
-                            <a:noFill/>
-                          </a:ln>
-                        </wps:spPr>
-                        <wps:txbx>
-                          <w:txbxContent>
-                            <w:p>
-                              <w:pPr>
-                                <w:jc w:val="left"/>
-                                <w:spacing w:before="0" w:after="0" w:line="240" w:lineRule="auto"/>
-                              </w:pPr>
-                              <w:r>
-                                <w:rPr>
-                                  <w:b/>
-                                  <w:caps w:val="true"/>
-                                  <w:spacing w:val="8"/>
-                                  <w:color w:val="0A5B3D"/>
-                                  <w:sz w:val="15"/>
-                                  <w:rFonts w:ascii="Inter" w:hAnsi="Inter"/>
-                                </w:rPr>
-                                <w:t xml:space="preserve">Evidence</w:t>
-                              </w:r>
-                            </w:p>
-                          </w:txbxContent>
-                        </wps:txbx>
-                        <wps:bodyPr rot="0" anchor="ctr" anchorCtr="0" lIns="64008" tIns="0" rIns="45720" bIns="0"/>
-                      </wps:wsp>
-                    </a:graphicData>
-                  </a:graphic>
-                </wp:inline>
-              </w:drawing>
+              <w:rPr>
+                <w:b/>
+                <w:caps w:val="true"/>
+                <w:spacing w:val="10"/>
+                <w:color w:val="0A5B3D"/>
+                <w:sz w:val="17"/>
+                <w:rFonts w:ascii="Inter" w:hAnsi="Inter"/>
+              </w:rPr>
+              <w:t xml:space="preserve">Evidence</w:t>
             </w:r>
           </w:p>
           <w:p>
@@ -2300,7 +2123,7 @@
     <w:qFormat/>
     <w:rsid w:val="00FC693F"/>
     <w:pPr>
-      <w:spacing w:after="100" w:line="269" w:lineRule="auto"/>
+      <w:spacing w:after="100" w:line="317" w:lineRule="auto"/>
     </w:pPr>
     <w:rPr>
       <w:rFonts w:ascii="Inter" w:hAnsi="Inter" w:cs="Inter"/>
@@ -2371,9 +2194,11 @@
       <w:rFonts w:ascii="Inter" w:hAnsi="Inter" w:cs="Inter"/>
       <w:b/>
       <w:bCs/>
-      <w:color w:val="0A5B3D"/>
-      <w:sz w:val="32"/>
+      <w:color w:val="3D4B59"/>
+      <w:sz w:val="30"/>
       <w:szCs w:val="28"/>
+      <w:caps w:val="true"/>
+      <w:spacing w:val="10"/>
     </w:rPr>
   </w:style>
   <w:style w:type="paragraph" w:styleId="Heading2">
@@ -2396,7 +2221,7 @@
       <w:b/>
       <w:bCs/>
       <w:color w:val="131B24"/>
-      <w:sz w:val="25"/>
+      <w:sz w:val="28"/>
       <w:szCs w:val="26"/>
     </w:rPr>
   </w:style>
@@ -2420,7 +2245,7 @@
       <w:b/>
       <w:bCs/>
       <w:color w:val="131B24"/>
-      <w:sz w:val="22"/>
+      <w:sz w:val="24"/>
     </w:rPr>
   </w:style>
   <w:style w:type="paragraph" w:styleId="Heading4">
@@ -2671,7 +2496,7 @@
       <w:color w:val="131B24"/>
       <w:spacing w:val="5"/>
       <w:kern w:val="28"/>
-      <w:sz w:val="52"/>
+      <w:sz w:val="56"/>
       <w:szCs w:val="52"/>
     </w:rPr>
   </w:style>

</xml_diff>

<commit_message>
feat(scribble): report cover shows client display-name + assessor
The UKG cover showed the client SLUG twice (Client/Company 'BF-UKG') and no assessor. Root cause: the
report context read client.name (the identifier), never client.company_name (the display field added with
/api/v1/clients), and carried no assessor at all.

- client_display_name(client) — one home for the preference (company_name display field -> slug name),
  called from both context.py and the {{COMPANY_NAME}} resolver. getattr-default keeps it safe against the
  standalone scribble_clients model (slug-only); mounted, resolve_client returns the core clients row.
- ReportContext gains an 'assessor' field (engagement.created_by); threaded into the docx context and
  rendered as a guarded Assessor row on the cover (omitted when unset, like the testing-window row).
- Regenerated default.docx. Tests: display-name predicate, assessor surfaced, engagement override wins.
</commit_message>
<xml_diff>
--- a/scribble/scribble/report_templates/default.docx
+++ b/scribble/scribble/report_templates/default.docx
@@ -193,6 +193,43 @@
           <w:sz w:val="22"/>
         </w:rPr>
         <w:t>{{ generated_date }}</w:t>
+      </w:r>
+    </w:p>
+    <w:p>
+      <w:r>
+        <w:t>{%p if assessor %}</w:t>
+      </w:r>
+    </w:p>
+    <w:p>
+      <w:pPr>
+        <w:spacing w:before="20" w:after="20"/>
+      </w:pPr>
+      <w:r>
+        <w:rPr>
+          <w:rFonts w:ascii="Inter" w:hAnsi="Inter"/>
+          <w:b/>
+          <w:i w:val="0"/>
+          <w:color w:val="6B7A89"/>
+          <w:sz w:val="18"/>
+          <w:caps w:val="true"/>
+          <w:spacing w:val="8"/>
+        </w:rPr>
+        <w:t xml:space="preserve">Assessor   </w:t>
+      </w:r>
+      <w:r>
+        <w:rPr>
+          <w:rFonts w:ascii="Inter" w:hAnsi="Inter"/>
+          <w:b/>
+          <w:i w:val="0"/>
+          <w:color w:val="131B24"/>
+          <w:sz w:val="22"/>
+        </w:rPr>
+        <w:t>{{ assessor }}</w:t>
+      </w:r>
+    </w:p>
+    <w:p>
+      <w:r>
+        <w:t>{%p endif %}</w:t>
       </w:r>
     </w:p>
     <w:p>

</xml_diff>

<commit_message>
fix(scribble): omit empty Client/Assessment-type cover rows; eyebrow fallback
Follow-up to the report style pass (#316). A clientless engagement printed a blank
eyebrow and a 'CLIENT' row with no value. Guard the Client and Assessment-type rows
with {%p if %} and fall back the eyebrow to a generic label — the same omit-when-empty
rule already applied to the testing-window and assessor rows, and parity with
render_html _cover_facts (omit) and its eyebrow (client or company or 'Security Assessment').
</commit_message>
<xml_diff>
--- a/scribble/scribble/report_templates/default.docx
+++ b/scribble/scribble/report_templates/default.docx
@@ -41,7 +41,7 @@
           <w:caps w:val="true"/>
           <w:spacing w:val="8"/>
         </w:rPr>
-        <w:t>{{ client_name or company_name }}</w:t>
+        <w:t>{{ client_name or company_name or 'Security Assessment' }}</w:t>
       </w:r>
     </w:p>
     <w:p>
@@ -78,6 +78,11 @@
       </w:r>
     </w:p>
     <w:p>
+      <w:r>
+        <w:t>{%p if client_name or company_name %}</w:t>
+      </w:r>
+    </w:p>
+    <w:p>
       <w:pPr>
         <w:spacing w:before="20" w:after="20"/>
       </w:pPr>
@@ -105,6 +110,16 @@
       </w:r>
     </w:p>
     <w:p>
+      <w:r>
+        <w:t>{%p endif %}</w:t>
+      </w:r>
+    </w:p>
+    <w:p>
+      <w:r>
+        <w:t>{%p if scope_type %}</w:t>
+      </w:r>
+    </w:p>
+    <w:p>
       <w:pPr>
         <w:spacing w:before="20" w:after="20"/>
       </w:pPr>
@@ -129,6 +144,11 @@
           <w:sz w:val="22"/>
         </w:rPr>
         <w:t>{{ scope_type }}</w:t>
+      </w:r>
+    </w:p>
+    <w:p>
+      <w:r>
+        <w:t>{%p endif %}</w:t>
       </w:r>
     </w:p>
     <w:p>

</xml_diff>